<commit_message>
manuális tesztelés belefűzése a tesztelési doksiba
</commit_message>
<xml_diff>
--- a/doc/teszteloi_es_felhasznaloi_dokumentacio/projekt_teszteles_dokumentacio_vegleges.docx
+++ b/doc/teszteloi_es_felhasznaloi_dokumentacio/projekt_teszteles_dokumentacio_vegleges.docx
@@ -11,7 +11,16 @@
         <w:t>Tesztelési dokumentáció</w:t>
       </w:r>
     </w:p>
-    <w:p/>
+    <w:p>
+      <w:pPr>
+        <w:pStyle w:val="Cmsor3"/>
+        <w:ind w:left="720"/>
+        <w:rPr>
+          <w:b/>
+          <w:bCs/>
+        </w:rPr>
+      </w:pPr>
+    </w:p>
     <w:p>
       <w:pPr>
         <w:pStyle w:val="Cmsor3"/>
@@ -29,69 +38,1055 @@
           <w:b/>
           <w:bCs/>
         </w:rPr>
-        <w:t xml:space="preserve">Miért a </w:t>
-      </w:r>
-      <w:proofErr w:type="spellStart"/>
-      <w:r>
-        <w:rPr>
-          <w:b/>
-          <w:bCs/>
-        </w:rPr>
-        <w:t>Cypress</w:t>
-      </w:r>
-      <w:proofErr w:type="spellEnd"/>
-      <w:r>
-        <w:rPr>
-          <w:b/>
-          <w:bCs/>
-        </w:rPr>
-        <w:t>?</w:t>
+        <w:t>Manuális tesztelési folyamatok</w:t>
       </w:r>
     </w:p>
     <w:p>
       <w:pPr>
+        <w:pStyle w:val="Listaszerbekezds"/>
+        <w:numPr>
+          <w:ilvl w:val="1"/>
+          <w:numId w:val="23"/>
+        </w:numPr>
+        <w:jc w:val="both"/>
+        <w:rPr>
+          <w:b/>
+          <w:bCs/>
+        </w:rPr>
+      </w:pPr>
+      <w:r>
+        <w:rPr>
+          <w:b/>
+          <w:bCs/>
+        </w:rPr>
+        <w:t xml:space="preserve">UI/UX és </w:t>
+      </w:r>
+      <w:proofErr w:type="spellStart"/>
+      <w:r>
+        <w:rPr>
+          <w:b/>
+          <w:bCs/>
+        </w:rPr>
+        <w:t>Reszponzívitás</w:t>
+      </w:r>
+      <w:proofErr w:type="spellEnd"/>
+      <w:r>
+        <w:rPr>
+          <w:b/>
+          <w:bCs/>
+        </w:rPr>
+        <w:t>:</w:t>
+      </w:r>
+      <w:r>
+        <w:rPr>
+          <w:b/>
+          <w:bCs/>
+        </w:rPr>
+        <w:t xml:space="preserve"> </w:t>
+      </w:r>
+      <w:r>
+        <w:t xml:space="preserve">Az alkalmazás felületeit, alapvetően Google </w:t>
+      </w:r>
+      <w:proofErr w:type="spellStart"/>
+      <w:r>
+        <w:t>Chromeban</w:t>
+      </w:r>
+      <w:proofErr w:type="spellEnd"/>
+      <w:r>
+        <w:t xml:space="preserve"> teszteltem. Továbbá teszteltem </w:t>
+      </w:r>
+      <w:proofErr w:type="spellStart"/>
+      <w:r>
+        <w:t>szkript</w:t>
+      </w:r>
+      <w:proofErr w:type="spellEnd"/>
+      <w:r>
+        <w:t xml:space="preserve"> segítségével, és manuálisan is, a mobil nézetet. Ezekben az esetekben kifejezetten a navigációs menüsáv, hamburger menüvé alakulására koncentráltam. Emellett, még megfigyeltem a termék</w:t>
+      </w:r>
+      <w:r>
+        <w:t>kártyák megfelelő mozgását a mobilnézetre való váltáskor.</w:t>
+      </w:r>
+    </w:p>
+    <w:p>
+      <w:pPr>
+        <w:pStyle w:val="Listaszerbekezds"/>
+        <w:ind w:left="1776"/>
+        <w:jc w:val="both"/>
+        <w:rPr>
+          <w:b/>
+          <w:bCs/>
+        </w:rPr>
+      </w:pPr>
+    </w:p>
+    <w:p>
+      <w:pPr>
+        <w:pStyle w:val="Listaszerbekezds"/>
+        <w:numPr>
+          <w:ilvl w:val="1"/>
+          <w:numId w:val="23"/>
+        </w:numPr>
+        <w:jc w:val="both"/>
+        <w:rPr>
+          <w:b/>
+          <w:bCs/>
+        </w:rPr>
+      </w:pPr>
+      <w:proofErr w:type="spellStart"/>
+      <w:r>
+        <w:rPr>
+          <w:b/>
+          <w:bCs/>
+        </w:rPr>
+        <w:t>Toast</w:t>
+      </w:r>
+      <w:proofErr w:type="spellEnd"/>
+      <w:r>
+        <w:rPr>
+          <w:b/>
+          <w:bCs/>
+        </w:rPr>
+        <w:t xml:space="preserve"> jelzések tesztelése: </w:t>
+      </w:r>
+      <w:r>
+        <w:t xml:space="preserve">A manuális tesztelések során még teszteltem továbbá a </w:t>
+      </w:r>
+      <w:proofErr w:type="spellStart"/>
+      <w:r>
+        <w:t>Toast</w:t>
+      </w:r>
+      <w:proofErr w:type="spellEnd"/>
+      <w:r>
+        <w:t xml:space="preserve"> kijelzést, különböző folyamatok esetén. Ilyenek voltak például, a bejelentkezés és a regisztráció, illetve a szervizidőpontfoglalás. </w:t>
+      </w:r>
+    </w:p>
+    <w:p>
+      <w:pPr>
+        <w:pStyle w:val="Listaszerbekezds"/>
+        <w:rPr>
+          <w:b/>
+          <w:bCs/>
+        </w:rPr>
+      </w:pPr>
+    </w:p>
+    <w:p>
+      <w:pPr>
+        <w:pStyle w:val="Listaszerbekezds"/>
+        <w:numPr>
+          <w:ilvl w:val="1"/>
+          <w:numId w:val="23"/>
+        </w:numPr>
+        <w:jc w:val="both"/>
+        <w:rPr>
+          <w:b/>
+          <w:bCs/>
+        </w:rPr>
+      </w:pPr>
+      <w:r>
+        <w:rPr>
+          <w:b/>
+          <w:bCs/>
+        </w:rPr>
+        <w:t xml:space="preserve">Intelligens átirányítás: </w:t>
+      </w:r>
+      <w:r>
+        <w:t>Mindezek mellett még teszteltem a rendszer megfelelő átirányítását. Amikor bejelentkezést igénylő oldalt próbálunk elérni, a sikeres bejelentkezési folyamat után, az általunk elérni kívánt oldalra irányít át az alkalmazás.</w:t>
+      </w:r>
+    </w:p>
+    <w:p>
+      <w:pPr>
+        <w:pStyle w:val="Listaszerbekezds"/>
+      </w:pPr>
+    </w:p>
+    <w:p>
+      <w:pPr>
+        <w:pStyle w:val="Listaszerbekezds"/>
+        <w:numPr>
+          <w:ilvl w:val="1"/>
+          <w:numId w:val="23"/>
+        </w:numPr>
+        <w:jc w:val="both"/>
+        <w:rPr>
+          <w:b/>
+          <w:bCs/>
+        </w:rPr>
+      </w:pPr>
+      <w:r>
+        <w:rPr>
+          <w:b/>
+          <w:bCs/>
+        </w:rPr>
+        <w:t>Hibaüzenetek és egyéb üzenetek:</w:t>
+      </w:r>
+      <w:r>
+        <w:rPr>
+          <w:b/>
+          <w:bCs/>
+        </w:rPr>
+        <w:t xml:space="preserve"> </w:t>
+      </w:r>
+      <w:r>
+        <w:rPr>
+          <w:b/>
+          <w:bCs/>
+        </w:rPr>
+        <w:t xml:space="preserve"> </w:t>
+      </w:r>
+      <w:r>
+        <w:t>Továbbá a manuális tesztelések során, teszteltem a megfelelő üzenetkijelzést, illetve a hibaüzenetek kijelzés</w:t>
+      </w:r>
+      <w:r>
+        <w:t xml:space="preserve">ét is, amelyek a backendről érkeznek. </w:t>
+      </w:r>
+    </w:p>
+    <w:p>
+      <w:pPr>
+        <w:pStyle w:val="Cmsor3"/>
+        <w:numPr>
+          <w:ilvl w:val="0"/>
+          <w:numId w:val="12"/>
+        </w:numPr>
+        <w:rPr>
+          <w:b/>
+          <w:bCs/>
+        </w:rPr>
+      </w:pPr>
+      <w:r>
+        <w:rPr>
+          <w:b/>
+          <w:bCs/>
+        </w:rPr>
+        <w:t>Környezeti izoláció:</w:t>
+      </w:r>
+    </w:p>
+    <w:p>
+      <w:pPr>
+        <w:ind w:left="1416"/>
+      </w:pPr>
+      <w:r>
+        <w:t xml:space="preserve">A tesztek előtt minden esetben egy </w:t>
+      </w:r>
+      <w:r>
+        <w:t xml:space="preserve">felépített </w:t>
+      </w:r>
+      <w:r>
+        <w:t>alaphelyze</w:t>
+      </w:r>
+      <w:r>
+        <w:t>tből indultak</w:t>
+      </w:r>
+      <w:r>
+        <w:t>,</w:t>
+      </w:r>
+      <w:r>
+        <w:t xml:space="preserve"> biztosítva a folyamatok közötti ütközések elkerülését.</w:t>
+      </w:r>
+      <w:r>
+        <w:t xml:space="preserve"> </w:t>
+      </w:r>
+      <w:r>
+        <w:t>E</w:t>
+      </w:r>
+      <w:r>
+        <w:t>z</w:t>
+      </w:r>
+      <w:r>
+        <w:t xml:space="preserve"> esetek nagy százalékában</w:t>
+      </w:r>
+      <w:r>
+        <w:t xml:space="preserve"> általában az alkalmazás főoldalára való látogatást jelentette.</w:t>
+      </w:r>
+      <w:r>
+        <w:t xml:space="preserve"> Egyes redundáns műveletek esetén(Regisztráció), a többszöri futtatás miatt keletkező adatkonfliktusok elkerülése érdekében, az adott tesztrészletet külön, szelektíven kezeltem. Ezzel biztosítva a tesztek folyamatosságát.</w:t>
+      </w:r>
+      <w:r>
+        <w:t xml:space="preserve"> </w:t>
+      </w:r>
+    </w:p>
+    <w:p>
+      <w:pPr>
+        <w:pStyle w:val="Cmsor3"/>
+        <w:numPr>
+          <w:ilvl w:val="0"/>
+          <w:numId w:val="12"/>
+        </w:numPr>
+        <w:rPr>
+          <w:b/>
+          <w:bCs/>
+        </w:rPr>
+      </w:pPr>
+      <w:proofErr w:type="spellStart"/>
+      <w:r>
+        <w:rPr>
+          <w:b/>
+          <w:bCs/>
+        </w:rPr>
+        <w:t>Zod</w:t>
+      </w:r>
+      <w:proofErr w:type="spellEnd"/>
+      <w:r>
+        <w:rPr>
+          <w:b/>
+          <w:bCs/>
+        </w:rPr>
+        <w:t xml:space="preserve"> alapú </w:t>
+      </w:r>
+      <w:r>
+        <w:rPr>
+          <w:b/>
+          <w:bCs/>
+        </w:rPr>
+        <w:t>típus és logikai biztonság és validáció:</w:t>
+      </w:r>
+    </w:p>
+    <w:p>
+      <w:pPr>
+        <w:ind w:left="1416"/>
+      </w:pPr>
+      <w:r>
+        <w:t xml:space="preserve">A tesztelések során az egyes folyamatokban nemcsak a működik, nem működik állapotot néztem, hanem azt is, hogy a </w:t>
+      </w:r>
+      <w:proofErr w:type="spellStart"/>
+      <w:r>
+        <w:t>Zod</w:t>
+      </w:r>
+      <w:proofErr w:type="spellEnd"/>
+      <w:r>
+        <w:t xml:space="preserve"> sémák megállítják-e a rossz adatokat.</w:t>
+      </w:r>
+    </w:p>
+    <w:p>
+      <w:pPr>
+        <w:ind w:left="1416"/>
+      </w:pPr>
+      <w:r>
+        <w:t>Ezek mellett a vizsgáltam, a frontend oldali validációk helyes működését, szándékosan túl rövid jelszó vagy rossz formátumú e-mail cím megadásával.</w:t>
+      </w:r>
+    </w:p>
+    <w:p>
+      <w:pPr>
+        <w:ind w:left="1416"/>
+      </w:pPr>
+    </w:p>
+    <w:p>
+      <w:pPr>
+        <w:pStyle w:val="Cmsor3"/>
+        <w:numPr>
+          <w:ilvl w:val="0"/>
+          <w:numId w:val="12"/>
+        </w:numPr>
+        <w:rPr>
+          <w:b/>
+          <w:bCs/>
+        </w:rPr>
+      </w:pPr>
+      <w:r>
+        <w:rPr>
+          <w:b/>
+          <w:bCs/>
+        </w:rPr>
+        <w:lastRenderedPageBreak/>
+        <w:t>Pozitív és Negatív tesztelési utak szétválasztása:</w:t>
+      </w:r>
+    </w:p>
+    <w:p>
+      <w:pPr>
+        <w:pStyle w:val="Listaszerbekezds"/>
+        <w:numPr>
+          <w:ilvl w:val="1"/>
+          <w:numId w:val="17"/>
+        </w:numPr>
+        <w:jc w:val="both"/>
+        <w:rPr>
+          <w:b/>
+          <w:bCs/>
+        </w:rPr>
+      </w:pPr>
+      <w:r>
+        <w:rPr>
+          <w:b/>
+          <w:bCs/>
+        </w:rPr>
+        <w:t xml:space="preserve"> </w:t>
+      </w:r>
+      <w:r>
+        <w:rPr>
+          <w:b/>
+          <w:bCs/>
+        </w:rPr>
+        <w:t xml:space="preserve">Pozitív út: </w:t>
+      </w:r>
+      <w:r>
+        <w:t xml:space="preserve"> </w:t>
+      </w:r>
+      <w:r>
+        <w:t>Olyan folyamatokat vizsgáltam, ahol minden bemeneti adat megfelel az elvárt üzleti logikának</w:t>
+      </w:r>
+      <w:r>
+        <w:t xml:space="preserve">, és minden a lépés a tervezett működés szerint működik. </w:t>
+      </w:r>
+      <w:r>
+        <w:t>(pl.: egy teljes vásárlási folyamat, a kosártól, a sikeres rendelésig, teljes szervizidőpontfoglalás)</w:t>
+      </w:r>
+    </w:p>
+    <w:p>
+      <w:pPr>
+        <w:pStyle w:val="Listaszerbekezds"/>
         <w:ind w:left="1440"/>
         <w:jc w:val="both"/>
-      </w:pPr>
-      <w:r>
-        <w:t xml:space="preserve">Az alkalmazás teszteléséhez a </w:t>
-      </w:r>
-      <w:proofErr w:type="spellStart"/>
-      <w:r>
-        <w:t>Cypress</w:t>
-      </w:r>
-      <w:proofErr w:type="spellEnd"/>
-      <w:r>
-        <w:t xml:space="preserve"> keretrendszert választottam. A keretrendszer egyszerűen lehetővé teszi a frontend folyamatok minőségi validációját. Viszonylag </w:t>
-      </w:r>
-      <w:r>
-        <w:t>gyorsan világossá vált számomra, hogy</w:t>
-      </w:r>
-      <w:r>
-        <w:t xml:space="preserve"> a </w:t>
-      </w:r>
-      <w:proofErr w:type="spellStart"/>
-      <w:r>
-        <w:t>Cypress</w:t>
-      </w:r>
-      <w:proofErr w:type="spellEnd"/>
-      <w:r>
-        <w:t xml:space="preserve"> valódi ereje a frontend tesztelésben rejlik</w:t>
-      </w:r>
-      <w:r>
-        <w:t xml:space="preserve">, tehát </w:t>
-      </w:r>
-      <w:r>
-        <w:t>egy külön böngészőablakban futtatja az appodat, és automatizáltan végrehajtja a tesz</w:t>
-      </w:r>
-      <w:r>
-        <w:t>tek egyes lépéseit.</w:t>
-      </w:r>
+        <w:rPr>
+          <w:b/>
+          <w:bCs/>
+        </w:rPr>
+      </w:pPr>
     </w:p>
     <w:p>
       <w:pPr>
+        <w:pStyle w:val="Listaszerbekezds"/>
+        <w:numPr>
+          <w:ilvl w:val="1"/>
+          <w:numId w:val="17"/>
+        </w:numPr>
+        <w:jc w:val="both"/>
+        <w:rPr>
+          <w:b/>
+          <w:bCs/>
+        </w:rPr>
+      </w:pPr>
+      <w:r>
+        <w:rPr>
+          <w:b/>
+          <w:bCs/>
+        </w:rPr>
+        <w:t xml:space="preserve"> </w:t>
+      </w:r>
+      <w:r>
+        <w:rPr>
+          <w:b/>
+          <w:bCs/>
+        </w:rPr>
+        <w:t>Negatív út:</w:t>
+      </w:r>
+      <w:r>
+        <w:rPr>
+          <w:b/>
+          <w:bCs/>
+        </w:rPr>
+        <w:t xml:space="preserve"> </w:t>
+      </w:r>
+      <w:r>
+        <w:t xml:space="preserve">A </w:t>
+      </w:r>
+      <w:proofErr w:type="spellStart"/>
+      <w:r>
+        <w:t>Zod</w:t>
+      </w:r>
+      <w:proofErr w:type="spellEnd"/>
+      <w:r>
+        <w:t xml:space="preserve"> sémák nem engedik át a hibás vagy érvénytelen adatokat</w:t>
+      </w:r>
+      <w:r>
+        <w:t xml:space="preserve"> az REST API felé, így védve a frontend oldalon a rendszert a hibás bemenettől.</w:t>
+      </w:r>
+      <w:r>
+        <w:rPr>
+          <w:b/>
+          <w:bCs/>
+        </w:rPr>
+        <w:t xml:space="preserve"> </w:t>
+      </w:r>
+      <w:r>
+        <w:t>Ebben az esetben szándékos hibákat vétek.(pl.: üresen hagyott mező, a szervizidőpont foglalás során). Ebben az esetben a tesztelés célja az volt, hogy a felhasználó minden esetben jól értelmezhető hibaüzeneteket kapjon.</w:t>
+      </w:r>
+    </w:p>
+    <w:p>
+      <w:pPr>
+        <w:pStyle w:val="Listaszerbekezds"/>
+        <w:rPr>
+          <w:b/>
+          <w:bCs/>
+        </w:rPr>
+      </w:pPr>
+    </w:p>
+    <w:p>
+      <w:pPr>
+        <w:pStyle w:val="Listaszerbekezds"/>
         <w:ind w:left="1440"/>
         <w:jc w:val="both"/>
+        <w:rPr>
+          <w:b/>
+          <w:bCs/>
+        </w:rPr>
+      </w:pPr>
+    </w:p>
+    <w:p>
+      <w:pPr>
+        <w:pStyle w:val="Listaszerbekezds"/>
+        <w:numPr>
+          <w:ilvl w:val="0"/>
+          <w:numId w:val="12"/>
+        </w:numPr>
+        <w:jc w:val="both"/>
+        <w:rPr>
+          <w:b/>
+          <w:bCs/>
+          <w:sz w:val="28"/>
+          <w:szCs w:val="28"/>
+        </w:rPr>
+      </w:pPr>
+      <w:r>
+        <w:rPr>
+          <w:b/>
+          <w:bCs/>
+          <w:sz w:val="28"/>
+          <w:szCs w:val="28"/>
+        </w:rPr>
+        <w:t>Indirekt adatkonzisztencia-ellenőrzés:</w:t>
+      </w:r>
+    </w:p>
+    <w:p>
+      <w:pPr>
+        <w:ind w:left="1416"/>
+      </w:pPr>
+      <w:r>
+        <w:t xml:space="preserve">Habár a </w:t>
+      </w:r>
+      <w:proofErr w:type="spellStart"/>
+      <w:r>
+        <w:t>Cypress</w:t>
+      </w:r>
+      <w:proofErr w:type="spellEnd"/>
+      <w:r>
+        <w:t xml:space="preserve"> a böngészőben fut, a háttérben többször ellenőriztem, az adatbázis kezelőben, hogy az adatok, amelyek a frontendről érkeztek helyesen </w:t>
+      </w:r>
+      <w:proofErr w:type="spellStart"/>
+      <w:r>
+        <w:t>tárolódtak</w:t>
+      </w:r>
+      <w:proofErr w:type="spellEnd"/>
+      <w:r>
+        <w:t>-e el, illetve a kizárólag adminisztrátor által látható felületek felé, az adatok megfelelően kerültek ki, a frontend számára.</w:t>
+      </w:r>
+    </w:p>
+    <w:p>
+      <w:pPr>
+        <w:ind w:left="1416"/>
+      </w:pPr>
+      <w:r>
+        <w:t>Ez a néhányszor megismételt ellenőrzési módszer kritikusnak bizonyult: Sikerült feltárnom és javítanom egy adatforgalmi anomáliát a szervizidőpontok kezelésénél biztosítva ezzel a pontos adatáramlást, a felhasználói és adminisztrátori felületek között.</w:t>
+      </w:r>
+    </w:p>
+    <w:p>
+      <w:pPr>
+        <w:pStyle w:val="Cmsor3"/>
+        <w:numPr>
+          <w:ilvl w:val="0"/>
+          <w:numId w:val="12"/>
+        </w:numPr>
+        <w:rPr>
+          <w:b/>
+          <w:bCs/>
+        </w:rPr>
+      </w:pPr>
+      <w:r>
+        <w:rPr>
+          <w:b/>
+          <w:bCs/>
+        </w:rPr>
+        <w:t>Diag</w:t>
+      </w:r>
+      <w:r>
+        <w:rPr>
+          <w:b/>
+          <w:bCs/>
+        </w:rPr>
+        <w:t xml:space="preserve">nosztikai eszközök használata: </w:t>
+      </w:r>
+    </w:p>
+    <w:p>
+      <w:pPr>
+        <w:ind w:left="1416"/>
+      </w:pPr>
+      <w:r>
+        <w:t>A tesztelés során több alkalommal is használtam a böngésző fejlesztői felületének „</w:t>
+      </w:r>
+      <w:proofErr w:type="spellStart"/>
+      <w:r>
+        <w:t>Elements</w:t>
+      </w:r>
+      <w:proofErr w:type="spellEnd"/>
+      <w:r>
+        <w:t>” nézetét, hogy a tesztelés során keresett elemet megtaláljam. A fejlesztés során a szemantikai szabályok betartása nem sikerült igazán. Így a böngésző fejlesztői felülete rendkívül hasznos volt számomra.</w:t>
+      </w:r>
+    </w:p>
+    <w:p/>
+    <w:p/>
+    <w:p/>
+    <w:p/>
+    <w:p>
+      <w:pPr>
+        <w:pStyle w:val="Cmsor3"/>
+        <w:numPr>
+          <w:ilvl w:val="0"/>
+          <w:numId w:val="12"/>
+        </w:numPr>
+        <w:rPr>
+          <w:b/>
+          <w:bCs/>
+        </w:rPr>
+      </w:pPr>
+      <w:r>
+        <w:rPr>
+          <w:b/>
+          <w:bCs/>
+        </w:rPr>
+        <w:t>Biztonság és útvonalvédelem verifikációja</w:t>
+      </w:r>
+      <w:r>
+        <w:rPr>
+          <w:b/>
+          <w:bCs/>
+        </w:rPr>
+        <w:t>:</w:t>
+      </w:r>
+    </w:p>
+    <w:p>
+      <w:pPr>
+        <w:ind w:left="1416"/>
+        <w:jc w:val="both"/>
+      </w:pPr>
+      <w:r>
+        <w:t>Ebben a részben az alkalmazás legkritikusabb helyein fellépő védelmeinek gyakorlati működését részletezem. A tesztelés során a jogosultságkezelés szigorú betartását vizsgáltam, két fő eseten keresztül.</w:t>
+      </w:r>
+      <w:r>
+        <w:t xml:space="preserve"> Jelen tesztesetekhez is a </w:t>
+      </w:r>
+      <w:proofErr w:type="spellStart"/>
+      <w:r>
+        <w:t>Cypresst</w:t>
+      </w:r>
+      <w:proofErr w:type="spellEnd"/>
+      <w:r>
+        <w:t xml:space="preserve"> használtam, így a tesztek bármikor reprodukálhatóak.</w:t>
+      </w:r>
+    </w:p>
+    <w:p>
+      <w:pPr>
+        <w:ind w:left="1416"/>
+        <w:jc w:val="both"/>
+      </w:pPr>
+    </w:p>
+    <w:p>
+      <w:pPr>
+        <w:pStyle w:val="Cmsor3"/>
+        <w:numPr>
+          <w:ilvl w:val="0"/>
+          <w:numId w:val="12"/>
+        </w:numPr>
+        <w:rPr>
+          <w:b/>
+          <w:bCs/>
+        </w:rPr>
+      </w:pPr>
+      <w:r>
+        <w:rPr>
+          <w:b/>
+          <w:bCs/>
+        </w:rPr>
+        <w:lastRenderedPageBreak/>
+        <w:t>Adminisztrátori jogosultság ellenőrzése:</w:t>
+      </w:r>
+    </w:p>
+    <w:p>
+      <w:pPr>
+        <w:ind w:left="1416"/>
+        <w:jc w:val="both"/>
+      </w:pPr>
+      <w:r>
+        <w:t>A teszt célja, annak igazolása volt, hogy az adminisztrátori felületek közül egyik sem érhető el, semmilyen körülmények között illetéktelenek számára.</w:t>
+      </w:r>
+    </w:p>
+    <w:p>
+      <w:pPr>
+        <w:pStyle w:val="Listaszerbekezds"/>
+        <w:numPr>
+          <w:ilvl w:val="1"/>
+          <w:numId w:val="18"/>
+        </w:numPr>
+        <w:jc w:val="both"/>
+      </w:pPr>
+      <w:r>
+        <w:rPr>
+          <w:b/>
+          <w:bCs/>
+        </w:rPr>
+        <w:t xml:space="preserve">     </w:t>
+      </w:r>
+      <w:r>
+        <w:rPr>
+          <w:b/>
+          <w:bCs/>
+        </w:rPr>
+        <w:t xml:space="preserve">Automatizált folyamat: </w:t>
+      </w:r>
+      <w:r>
+        <w:t xml:space="preserve">A </w:t>
+      </w:r>
+      <w:proofErr w:type="spellStart"/>
+      <w:r>
+        <w:t>Cypress</w:t>
+      </w:r>
+      <w:proofErr w:type="spellEnd"/>
+      <w:r>
+        <w:t xml:space="preserve"> kijelentkezett állapotban próbálta elérni a </w:t>
+      </w:r>
+      <w:proofErr w:type="spellStart"/>
+      <w:r>
+        <w:t>visit</w:t>
+      </w:r>
+      <w:proofErr w:type="spellEnd"/>
+      <w:r>
+        <w:t>(„/</w:t>
+      </w:r>
+      <w:proofErr w:type="spellStart"/>
+      <w:r>
+        <w:t>admin</w:t>
+      </w:r>
+      <w:proofErr w:type="spellEnd"/>
+      <w:r>
+        <w:t xml:space="preserve">”) parancs segítségével az </w:t>
+      </w:r>
+      <w:proofErr w:type="spellStart"/>
+      <w:r>
+        <w:t>admin</w:t>
+      </w:r>
+      <w:proofErr w:type="spellEnd"/>
+      <w:r>
+        <w:t xml:space="preserve"> felületet.</w:t>
+      </w:r>
+    </w:p>
+    <w:p>
+      <w:pPr>
+        <w:pStyle w:val="Listaszerbekezds"/>
+        <w:ind w:left="1440"/>
+        <w:jc w:val="both"/>
+      </w:pPr>
+    </w:p>
+    <w:p>
+      <w:pPr>
+        <w:pStyle w:val="Listaszerbekezds"/>
+        <w:numPr>
+          <w:ilvl w:val="1"/>
+          <w:numId w:val="18"/>
+        </w:numPr>
+        <w:jc w:val="both"/>
+      </w:pPr>
+      <w:r>
+        <w:rPr>
+          <w:b/>
+          <w:bCs/>
+        </w:rPr>
+        <w:t xml:space="preserve">     </w:t>
+      </w:r>
+      <w:r>
+        <w:rPr>
+          <w:b/>
+          <w:bCs/>
+        </w:rPr>
+        <w:t xml:space="preserve">Várt és tapasztalt eredmény: </w:t>
+      </w:r>
+      <w:r>
+        <w:t xml:space="preserve">A teszt során a </w:t>
+      </w:r>
+      <w:proofErr w:type="spellStart"/>
+      <w:r>
+        <w:t>Cypress</w:t>
+      </w:r>
+      <w:proofErr w:type="spellEnd"/>
+      <w:r>
+        <w:t xml:space="preserve"> „</w:t>
+      </w:r>
+      <w:proofErr w:type="spellStart"/>
+      <w:r>
+        <w:t>url</w:t>
+      </w:r>
+      <w:proofErr w:type="spellEnd"/>
+      <w:r>
+        <w:t>()</w:t>
+      </w:r>
+      <w:proofErr w:type="spellStart"/>
+      <w:r>
+        <w:t>should</w:t>
+      </w:r>
+      <w:proofErr w:type="spellEnd"/>
+      <w:r>
+        <w:t>(’</w:t>
+      </w:r>
+      <w:proofErr w:type="spellStart"/>
+      <w:r>
+        <w:t>include</w:t>
+      </w:r>
+      <w:proofErr w:type="spellEnd"/>
+      <w:r>
+        <w:t xml:space="preserve">’, ’/login’)” parancsával ellenőriztem, hogy az alkalmazás, azonnal (még a komponens </w:t>
+      </w:r>
+      <w:proofErr w:type="spellStart"/>
+      <w:r>
+        <w:t>renderelése</w:t>
+      </w:r>
+      <w:proofErr w:type="spellEnd"/>
+      <w:r>
+        <w:t xml:space="preserve"> előtt) </w:t>
+      </w:r>
+      <w:proofErr w:type="spellStart"/>
+      <w:r>
+        <w:t>átírányítja</w:t>
+      </w:r>
+      <w:proofErr w:type="spellEnd"/>
+      <w:r>
+        <w:t xml:space="preserve"> a felhasználót, a bejelentkezés oldalra.</w:t>
+      </w:r>
+    </w:p>
+    <w:p>
+      <w:pPr>
+        <w:pStyle w:val="Listaszerbekezds"/>
+      </w:pPr>
+    </w:p>
+    <w:p>
+      <w:pPr>
+        <w:pStyle w:val="Listaszerbekezds"/>
+        <w:numPr>
+          <w:ilvl w:val="1"/>
+          <w:numId w:val="18"/>
+        </w:numPr>
+        <w:jc w:val="both"/>
+      </w:pPr>
+      <w:r>
+        <w:rPr>
+          <w:b/>
+          <w:bCs/>
+        </w:rPr>
+        <w:t xml:space="preserve">    </w:t>
+      </w:r>
+      <w:r>
+        <w:rPr>
+          <w:b/>
+          <w:bCs/>
+        </w:rPr>
+        <w:t xml:space="preserve">Technikai jelentőség: </w:t>
+      </w:r>
+      <w:r>
+        <w:t xml:space="preserve">Ez igazolja, hogy az </w:t>
+      </w:r>
+      <w:proofErr w:type="spellStart"/>
+      <w:r>
+        <w:t>adminLoader</w:t>
+      </w:r>
+      <w:proofErr w:type="spellEnd"/>
+      <w:r>
+        <w:t xml:space="preserve"> </w:t>
+      </w:r>
+      <w:proofErr w:type="spellStart"/>
+      <w:r>
+        <w:t>guard</w:t>
+      </w:r>
+      <w:proofErr w:type="spellEnd"/>
+      <w:r>
+        <w:t xml:space="preserve"> aktívan figyeli a globális állapotot, és </w:t>
+      </w:r>
+      <w:proofErr w:type="spellStart"/>
+      <w:r>
+        <w:t>token</w:t>
+      </w:r>
+      <w:proofErr w:type="spellEnd"/>
+      <w:r>
+        <w:t xml:space="preserve">  hiányában, vagy  nem megfelelő jogosultsággal rendelkező felhasználó esetén megszakítja az útvonal kiszolgálását. </w:t>
+      </w:r>
+    </w:p>
+    <w:p>
+      <w:pPr>
+        <w:pStyle w:val="Cmsor3"/>
+        <w:numPr>
+          <w:ilvl w:val="0"/>
+          <w:numId w:val="12"/>
+        </w:numPr>
+        <w:rPr>
+          <w:b/>
+          <w:bCs/>
+        </w:rPr>
+      </w:pPr>
+      <w:r>
+        <w:rPr>
+          <w:b/>
+          <w:bCs/>
+        </w:rPr>
+        <w:t xml:space="preserve"> </w:t>
+      </w:r>
+      <w:r>
+        <w:rPr>
+          <w:b/>
+          <w:bCs/>
+        </w:rPr>
+        <w:t>Munkamenet-logika és visszaút-védelem:</w:t>
+      </w:r>
+    </w:p>
+    <w:p>
+      <w:pPr>
+        <w:ind w:left="1416"/>
+      </w:pPr>
+      <w:r>
+        <w:t>A teszteset azt logikai szabályt ellenőrizte, miszerint egy már bejelentkezett, felhasználó nem érheti el a vendég-specifikus oldalakat. (pl.: Bejelentkezés)</w:t>
+      </w:r>
+    </w:p>
+    <w:p>
+      <w:pPr>
+        <w:pStyle w:val="Listaszerbekezds"/>
+        <w:numPr>
+          <w:ilvl w:val="1"/>
+          <w:numId w:val="19"/>
+        </w:numPr>
+        <w:rPr>
+          <w:b/>
+          <w:bCs/>
+        </w:rPr>
+      </w:pPr>
+      <w:r>
+        <w:rPr>
+          <w:b/>
+          <w:bCs/>
+        </w:rPr>
+        <w:t xml:space="preserve"> </w:t>
+      </w:r>
+      <w:r>
+        <w:rPr>
+          <w:b/>
+          <w:bCs/>
+        </w:rPr>
+        <w:tab/>
+      </w:r>
+      <w:r>
+        <w:rPr>
+          <w:b/>
+          <w:bCs/>
+        </w:rPr>
+        <w:t>Automatizált folyamat:</w:t>
+      </w:r>
+      <w:r>
+        <w:rPr>
+          <w:b/>
+          <w:bCs/>
+        </w:rPr>
+        <w:t xml:space="preserve">  </w:t>
+      </w:r>
+      <w:r>
+        <w:t xml:space="preserve">A teszt script elsősorban végrehajtott egy sikeres bejelentkezési folyamatot, majd megkísérelte a </w:t>
+      </w:r>
+      <w:proofErr w:type="spellStart"/>
+      <w:r>
+        <w:t>visit</w:t>
+      </w:r>
+      <w:proofErr w:type="spellEnd"/>
+      <w:r>
+        <w:t>(’/login’) parancs futtatását.</w:t>
+      </w:r>
+    </w:p>
+    <w:p>
+      <w:pPr>
+        <w:pStyle w:val="Listaszerbekezds"/>
+        <w:ind w:left="1440"/>
+        <w:rPr>
+          <w:b/>
+          <w:bCs/>
+        </w:rPr>
+      </w:pPr>
+    </w:p>
+    <w:p>
+      <w:pPr>
+        <w:pStyle w:val="Listaszerbekezds"/>
+        <w:numPr>
+          <w:ilvl w:val="1"/>
+          <w:numId w:val="19"/>
+        </w:numPr>
+        <w:rPr>
+          <w:b/>
+          <w:bCs/>
+        </w:rPr>
+      </w:pPr>
+      <w:r>
+        <w:rPr>
+          <w:b/>
+          <w:bCs/>
+        </w:rPr>
+        <w:t xml:space="preserve"> </w:t>
+      </w:r>
+      <w:r>
+        <w:rPr>
+          <w:b/>
+          <w:bCs/>
+        </w:rPr>
+        <w:tab/>
+      </w:r>
+      <w:r>
+        <w:rPr>
+          <w:b/>
+          <w:bCs/>
+        </w:rPr>
+        <w:t xml:space="preserve">Várt és tapasztalt eredmény: </w:t>
+      </w:r>
+      <w:r>
+        <w:t xml:space="preserve">A </w:t>
+      </w:r>
+      <w:proofErr w:type="spellStart"/>
+      <w:r>
+        <w:t>Cypress</w:t>
+      </w:r>
+      <w:proofErr w:type="spellEnd"/>
+      <w:r>
+        <w:t xml:space="preserve"> segítségével igazoltam, hogy a rendszer észleli az aktív munkamenetet, és automatikusan visszairányítja a felhasználót, a kezdőoldalra.</w:t>
+      </w:r>
+    </w:p>
+    <w:p>
+      <w:pPr>
+        <w:pStyle w:val="Listaszerbekezds"/>
+        <w:ind w:left="1440"/>
+        <w:rPr>
+          <w:b/>
+          <w:bCs/>
+        </w:rPr>
+      </w:pPr>
+    </w:p>
+    <w:p>
+      <w:pPr>
+        <w:ind w:left="24"/>
+        <w:rPr>
+          <w:b/>
+          <w:bCs/>
+        </w:rPr>
+      </w:pPr>
+    </w:p>
+    <w:p>
+      <w:pPr>
+        <w:ind w:left="24"/>
+        <w:rPr>
+          <w:b/>
+          <w:bCs/>
+        </w:rPr>
+      </w:pPr>
+    </w:p>
+    <w:p>
+      <w:pPr>
+        <w:ind w:left="24"/>
+        <w:rPr>
+          <w:b/>
+          <w:bCs/>
+        </w:rPr>
+      </w:pPr>
+    </w:p>
+    <w:p>
+      <w:pPr>
+        <w:rPr>
+          <w:b/>
+          <w:bCs/>
+        </w:rPr>
       </w:pPr>
     </w:p>
     <w:p>
@@ -112,7 +1107,7 @@
           <w:b/>
           <w:bCs/>
         </w:rPr>
-        <w:t>Hibakeresés/</w:t>
+        <w:t xml:space="preserve"> </w:t>
       </w:r>
       <w:proofErr w:type="spellStart"/>
       <w:r>
@@ -120,7 +1115,7 @@
           <w:b/>
           <w:bCs/>
         </w:rPr>
-        <w:t>Debugging</w:t>
+        <w:t>Reszponzivitás</w:t>
       </w:r>
       <w:proofErr w:type="spellEnd"/>
       <w:r>
@@ -128,15 +1123,32 @@
           <w:b/>
           <w:bCs/>
         </w:rPr>
-        <w:t>:</w:t>
+        <w:t xml:space="preserve"> és </w:t>
+      </w:r>
+      <w:proofErr w:type="spellStart"/>
+      <w:r>
+        <w:rPr>
+          <w:b/>
+          <w:bCs/>
+        </w:rPr>
+        <w:t>Viewport</w:t>
+      </w:r>
+      <w:proofErr w:type="spellEnd"/>
+      <w:r>
+        <w:rPr>
+          <w:b/>
+          <w:bCs/>
+        </w:rPr>
+        <w:t xml:space="preserve"> tesztelés</w:t>
       </w:r>
     </w:p>
     <w:p>
       <w:pPr>
-        <w:ind w:left="1416"/>
-      </w:pPr>
-      <w:r>
-        <w:t xml:space="preserve">A </w:t>
+        <w:ind w:left="2124"/>
+        <w:jc w:val="both"/>
+      </w:pPr>
+      <w:r>
+        <w:t xml:space="preserve">A webshop modern elvárásaihoz igazodva elengedhetetlen volt a mobilbarát design ellenőrzése is. A tesztelés során a </w:t>
       </w:r>
       <w:proofErr w:type="spellStart"/>
       <w:r>
@@ -144,7 +1156,18 @@
       </w:r>
       <w:proofErr w:type="spellEnd"/>
       <w:r>
-        <w:t xml:space="preserve"> keretrendszer továbbá kiváló lehetőséget egy-egy teszt külön futtatására is és nyomon követésére. Ez a megközelítés rendkívül hatékonnyá tette a hibakeresési folyamatot:</w:t>
+        <w:t xml:space="preserve"> segítségével szimuláltam különböző </w:t>
+      </w:r>
+      <w:proofErr w:type="spellStart"/>
+      <w:r>
+        <w:t>kijelzőméretet</w:t>
+      </w:r>
+      <w:proofErr w:type="spellEnd"/>
+      <w:r>
+        <w:t>. (IPhone XR</w:t>
+      </w:r>
+      <w:r>
+        <w:t>)</w:t>
       </w:r>
     </w:p>
     <w:p>
@@ -152,46 +1175,66 @@
         <w:pStyle w:val="Listaszerbekezds"/>
         <w:numPr>
           <w:ilvl w:val="1"/>
-          <w:numId w:val="16"/>
+          <w:numId w:val="21"/>
         </w:numPr>
-      </w:pPr>
-      <w:r>
-        <w:rPr>
-          <w:b/>
-          <w:bCs/>
-        </w:rPr>
-        <w:t xml:space="preserve"> </w:t>
+        <w:jc w:val="both"/>
+        <w:rPr>
+          <w:b/>
+          <w:bCs/>
+        </w:rPr>
+      </w:pPr>
+      <w:r>
+        <w:rPr>
+          <w:b/>
+          <w:bCs/>
+        </w:rPr>
+        <w:t xml:space="preserve">Vizuális átrendeződés: </w:t>
+      </w:r>
+      <w:r>
+        <w:t xml:space="preserve">Ellenőriztem, hogy a főoldalon található </w:t>
       </w:r>
       <w:proofErr w:type="spellStart"/>
       <w:r>
-        <w:rPr>
-          <w:b/>
-          <w:bCs/>
-        </w:rPr>
-        <w:t>Folyamatbeli</w:t>
+        <w:t>Flowbite-React</w:t>
       </w:r>
       <w:proofErr w:type="spellEnd"/>
       <w:r>
-        <w:rPr>
-          <w:b/>
-          <w:bCs/>
-        </w:rPr>
-        <w:t xml:space="preserve"> visszatekintés:</w:t>
-      </w:r>
-      <w:r>
-        <w:t xml:space="preserve"> Az előnézet segítségével rövid idő alatt </w:t>
-      </w:r>
-      <w:r>
-        <w:t xml:space="preserve"> </w:t>
-      </w:r>
-      <w:r>
-        <w:t>átláthatóvá vált a probléma, amely miatt a teszt hibára futott.</w:t>
+        <w:t xml:space="preserve"> komponensek (Nav</w:t>
+      </w:r>
+      <w:r>
+        <w:t>igációs sáv</w:t>
+      </w:r>
+      <w:r>
+        <w:t xml:space="preserve">, keresés űrlap, termékkártyák) megfelelően alkalmazkodnak a kisebb kijelzőkhöz. </w:t>
+      </w:r>
+      <w:r>
+        <w:lastRenderedPageBreak/>
+        <w:t xml:space="preserve">Elsősorban a </w:t>
+      </w:r>
+      <w:r>
+        <w:t>Navigációs sáv</w:t>
+      </w:r>
+      <w:r>
+        <w:t xml:space="preserve"> hamburger menübe való </w:t>
+      </w:r>
+      <w:proofErr w:type="spellStart"/>
+      <w:r>
+        <w:t>csoportulását</w:t>
+      </w:r>
+      <w:proofErr w:type="spellEnd"/>
+      <w:r>
+        <w:t xml:space="preserve"> ellenőriztem, ezzel biztosítva a könnyű kezelhetőséget.</w:t>
       </w:r>
     </w:p>
     <w:p>
       <w:pPr>
         <w:pStyle w:val="Listaszerbekezds"/>
-        <w:ind w:left="1440"/>
+        <w:ind w:left="2484"/>
+        <w:jc w:val="both"/>
+        <w:rPr>
+          <w:b/>
+          <w:bCs/>
+        </w:rPr>
       </w:pPr>
     </w:p>
     <w:p>
@@ -199,913 +1242,42 @@
         <w:pStyle w:val="Listaszerbekezds"/>
         <w:numPr>
           <w:ilvl w:val="1"/>
-          <w:numId w:val="16"/>
+          <w:numId w:val="21"/>
         </w:numPr>
-      </w:pPr>
-      <w:r>
-        <w:rPr>
-          <w:b/>
-          <w:bCs/>
-        </w:rPr>
-        <w:t xml:space="preserve"> </w:t>
-      </w:r>
-      <w:r>
-        <w:rPr>
-          <w:b/>
-          <w:bCs/>
-        </w:rPr>
-        <w:t>Hatékonyság növelése:</w:t>
-      </w:r>
-      <w:r>
-        <w:t xml:space="preserve"> A hibák gyors és könnyű felismerése, illetve a részletes hibaüzenetek segítségével a frontend tesztelésre fordított idő jelentősen rövidült, </w:t>
-      </w:r>
-      <w:r>
-        <w:t>növelve a hatékonyságot.</w:t>
+        <w:jc w:val="both"/>
+        <w:rPr>
+          <w:b/>
+          <w:bCs/>
+        </w:rPr>
+      </w:pPr>
+      <w:r>
+        <w:rPr>
+          <w:b/>
+          <w:bCs/>
+        </w:rPr>
+        <w:t xml:space="preserve">Interakciók: </w:t>
+      </w:r>
+      <w:r>
+        <w:t xml:space="preserve">Továbbá vizsgáltam, </w:t>
+      </w:r>
+      <w:proofErr w:type="spellStart"/>
+      <w:r>
+        <w:t>érintőkijelzős</w:t>
+      </w:r>
+      <w:proofErr w:type="spellEnd"/>
+      <w:r>
+        <w:t xml:space="preserve"> használatot szimulálva a gombok elérhetőek-e, láthatóak-e, és nem fordul-e elő az elemek egymásra vagy elcsúszása, különösen a </w:t>
+      </w:r>
+      <w:r>
+        <w:t xml:space="preserve">Navigációs sáv </w:t>
+      </w:r>
+      <w:r>
+        <w:t>komponens esetében.</w:t>
       </w:r>
     </w:p>
     <w:p>
       <w:pPr>
         <w:pStyle w:val="Listaszerbekezds"/>
-      </w:pPr>
-    </w:p>
-    <w:p>
-      <w:pPr>
-        <w:pStyle w:val="Listaszerbekezds"/>
-        <w:numPr>
-          <w:ilvl w:val="1"/>
-          <w:numId w:val="16"/>
-        </w:numPr>
-      </w:pPr>
-      <w:r>
-        <w:rPr>
-          <w:b/>
-          <w:bCs/>
-        </w:rPr>
-        <w:t xml:space="preserve"> </w:t>
-      </w:r>
-      <w:r>
-        <w:rPr>
-          <w:b/>
-          <w:bCs/>
-        </w:rPr>
-        <w:t xml:space="preserve">Stabilitás: </w:t>
-      </w:r>
-      <w:r>
-        <w:t>A visszajelzéseknek és a jelenségek könnyű átláthatóságá</w:t>
-      </w:r>
-      <w:r>
-        <w:t>nak köszönhetően a  tesztelés során fellépő komplexebb problémák, rövid idő alatt érthetővé és javíthatóvá váltak.</w:t>
-      </w:r>
-    </w:p>
-    <w:p/>
-    <w:p>
-      <w:pPr>
-        <w:pStyle w:val="Cmsor3"/>
-        <w:numPr>
-          <w:ilvl w:val="0"/>
-          <w:numId w:val="12"/>
-        </w:numPr>
-        <w:rPr>
-          <w:b/>
-          <w:bCs/>
-        </w:rPr>
-      </w:pPr>
-      <w:r>
-        <w:rPr>
-          <w:b/>
-          <w:bCs/>
-        </w:rPr>
-        <w:t>Környezeti izoláció:</w:t>
-      </w:r>
-    </w:p>
-    <w:p>
-      <w:pPr>
-        <w:ind w:left="1416"/>
-      </w:pPr>
-      <w:r>
-        <w:t xml:space="preserve">A tesztek előtt minden esetben egy </w:t>
-      </w:r>
-      <w:r>
-        <w:t xml:space="preserve">felépített </w:t>
-      </w:r>
-      <w:r>
-        <w:t>alaphelyze</w:t>
-      </w:r>
-      <w:r>
-        <w:t>tből indultak</w:t>
-      </w:r>
-      <w:r>
-        <w:t>,</w:t>
-      </w:r>
-      <w:r>
-        <w:t xml:space="preserve"> biztosítva a folyamatok közötti ütközések elkerülését.</w:t>
-      </w:r>
-      <w:r>
-        <w:t xml:space="preserve"> </w:t>
-      </w:r>
-      <w:r>
-        <w:t>E</w:t>
-      </w:r>
-      <w:r>
-        <w:t>z</w:t>
-      </w:r>
-      <w:r>
-        <w:t xml:space="preserve"> esetek nagy százalékában</w:t>
-      </w:r>
-      <w:r>
-        <w:t xml:space="preserve"> általában az alkalmazás főoldalára való látogatást jelentette.</w:t>
-      </w:r>
-      <w:r>
-        <w:t xml:space="preserve"> Egyes redundáns műveletek esetén(Regisztráció), a többszöri futtatás miatt keletkező adatkonfliktusok elkerülése érdekében, az adott tesztrészletet külön, szelektíven kezeltem. Ezzel biztosítva a tesztek folyamatosságát.</w:t>
-      </w:r>
-      <w:r>
-        <w:t xml:space="preserve"> </w:t>
-      </w:r>
-    </w:p>
-    <w:p>
-      <w:pPr>
-        <w:pStyle w:val="Cmsor3"/>
-        <w:numPr>
-          <w:ilvl w:val="0"/>
-          <w:numId w:val="12"/>
-        </w:numPr>
-        <w:rPr>
-          <w:b/>
-          <w:bCs/>
-        </w:rPr>
-      </w:pPr>
-      <w:proofErr w:type="spellStart"/>
-      <w:r>
-        <w:rPr>
-          <w:b/>
-          <w:bCs/>
-        </w:rPr>
-        <w:t>Zod</w:t>
-      </w:r>
-      <w:proofErr w:type="spellEnd"/>
-      <w:r>
-        <w:rPr>
-          <w:b/>
-          <w:bCs/>
-        </w:rPr>
-        <w:t xml:space="preserve"> alapú </w:t>
-      </w:r>
-      <w:r>
-        <w:rPr>
-          <w:b/>
-          <w:bCs/>
-        </w:rPr>
-        <w:t>típus és logikai biztonság és validáció:</w:t>
-      </w:r>
-    </w:p>
-    <w:p>
-      <w:pPr>
-        <w:ind w:left="1416"/>
-      </w:pPr>
-      <w:r>
-        <w:t xml:space="preserve">A tesztelések során az egyes folyamatokban nemcsak a működik, nem működik állapotot néztem, hanem azt is, hogy a </w:t>
-      </w:r>
-      <w:proofErr w:type="spellStart"/>
-      <w:r>
-        <w:t>Zod</w:t>
-      </w:r>
-      <w:proofErr w:type="spellEnd"/>
-      <w:r>
-        <w:t xml:space="preserve"> sémák megállítják-e a rossz adatokat.</w:t>
-      </w:r>
-    </w:p>
-    <w:p>
-      <w:pPr>
-        <w:ind w:left="1416"/>
-      </w:pPr>
-      <w:r>
-        <w:lastRenderedPageBreak/>
-        <w:t>Ezek mellett a vizsgáltam, a frontend oldali validációk helyes működését, szándékosan túl rövid jelszó vagy rossz formátumú e-mail cím megadásával.</w:t>
-      </w:r>
-    </w:p>
-    <w:p>
-      <w:pPr>
-        <w:ind w:left="1416"/>
-      </w:pPr>
-    </w:p>
-    <w:p>
-      <w:pPr>
-        <w:pStyle w:val="Cmsor3"/>
-        <w:numPr>
-          <w:ilvl w:val="0"/>
-          <w:numId w:val="12"/>
-        </w:numPr>
-        <w:rPr>
-          <w:b/>
-          <w:bCs/>
-        </w:rPr>
-      </w:pPr>
-      <w:r>
-        <w:rPr>
-          <w:b/>
-          <w:bCs/>
-        </w:rPr>
-        <w:t>Pozitív és Negatív tesztelési utak szétválasztása:</w:t>
-      </w:r>
-    </w:p>
-    <w:p>
-      <w:pPr>
-        <w:pStyle w:val="Listaszerbekezds"/>
-        <w:numPr>
-          <w:ilvl w:val="1"/>
-          <w:numId w:val="17"/>
-        </w:numPr>
-        <w:jc w:val="both"/>
-        <w:rPr>
-          <w:b/>
-          <w:bCs/>
-        </w:rPr>
-      </w:pPr>
-      <w:r>
-        <w:rPr>
-          <w:b/>
-          <w:bCs/>
-        </w:rPr>
-        <w:t xml:space="preserve"> </w:t>
-      </w:r>
-      <w:r>
-        <w:rPr>
-          <w:b/>
-          <w:bCs/>
-        </w:rPr>
-        <w:t xml:space="preserve">Pozitív út: </w:t>
-      </w:r>
-      <w:r>
-        <w:t xml:space="preserve"> </w:t>
-      </w:r>
-      <w:r>
-        <w:t>Olyan folyamatokat vizsgáltam, ahol minden bemeneti adat megfelel az elvárt üzleti logikának</w:t>
-      </w:r>
-      <w:r>
-        <w:t xml:space="preserve">, és minden a lépés a tervezett működés szerint működik. </w:t>
-      </w:r>
-      <w:r>
-        <w:t>(pl.: egy teljes vásárlási folyamat, a kosártól, a sikeres rendelésig, teljes szervizidőpontfoglalás)</w:t>
-      </w:r>
-    </w:p>
-    <w:p>
-      <w:pPr>
-        <w:pStyle w:val="Listaszerbekezds"/>
-        <w:ind w:left="1440"/>
-        <w:jc w:val="both"/>
-        <w:rPr>
-          <w:b/>
-          <w:bCs/>
-        </w:rPr>
-      </w:pPr>
-    </w:p>
-    <w:p>
-      <w:pPr>
-        <w:pStyle w:val="Listaszerbekezds"/>
-        <w:numPr>
-          <w:ilvl w:val="1"/>
-          <w:numId w:val="17"/>
-        </w:numPr>
-        <w:jc w:val="both"/>
-        <w:rPr>
-          <w:b/>
-          <w:bCs/>
-        </w:rPr>
-      </w:pPr>
-      <w:r>
-        <w:rPr>
-          <w:b/>
-          <w:bCs/>
-        </w:rPr>
-        <w:t xml:space="preserve"> </w:t>
-      </w:r>
-      <w:r>
-        <w:rPr>
-          <w:b/>
-          <w:bCs/>
-        </w:rPr>
-        <w:t>Negatív út:</w:t>
-      </w:r>
-      <w:r>
-        <w:rPr>
-          <w:b/>
-          <w:bCs/>
-        </w:rPr>
-        <w:t xml:space="preserve"> </w:t>
-      </w:r>
-      <w:r>
-        <w:t xml:space="preserve">A </w:t>
-      </w:r>
-      <w:proofErr w:type="spellStart"/>
-      <w:r>
-        <w:t>Zod</w:t>
-      </w:r>
-      <w:proofErr w:type="spellEnd"/>
-      <w:r>
-        <w:t xml:space="preserve"> sémák nem engedik át a hibás vagy érvénytelen adatokat</w:t>
-      </w:r>
-      <w:r>
-        <w:t xml:space="preserve"> az REST API felé, így védve a frontend oldalon a rendszert a hibás bemenettől.</w:t>
-      </w:r>
-      <w:r>
-        <w:rPr>
-          <w:b/>
-          <w:bCs/>
-        </w:rPr>
-        <w:t xml:space="preserve"> </w:t>
-      </w:r>
-      <w:r>
-        <w:t>Ebben az esetben szándékos hibákat vétek.(pl.: üresen hagyott mező, a szervizidőpont foglalás során). Ebben az esetben a tesztelés célja az volt, hogy a felhasználó minden esetben jól értelmezhető hibaüzeneteket kapjon.</w:t>
-      </w:r>
-    </w:p>
-    <w:p>
-      <w:pPr>
-        <w:pStyle w:val="Listaszerbekezds"/>
-        <w:rPr>
-          <w:b/>
-          <w:bCs/>
-        </w:rPr>
-      </w:pPr>
-    </w:p>
-    <w:p>
-      <w:pPr>
-        <w:pStyle w:val="Listaszerbekezds"/>
-        <w:ind w:left="1440"/>
-        <w:jc w:val="both"/>
-        <w:rPr>
-          <w:b/>
-          <w:bCs/>
-        </w:rPr>
-      </w:pPr>
-    </w:p>
-    <w:p>
-      <w:pPr>
-        <w:pStyle w:val="Listaszerbekezds"/>
-        <w:numPr>
-          <w:ilvl w:val="0"/>
-          <w:numId w:val="12"/>
-        </w:numPr>
-        <w:jc w:val="both"/>
-        <w:rPr>
-          <w:b/>
-          <w:bCs/>
-          <w:sz w:val="28"/>
-          <w:szCs w:val="28"/>
-        </w:rPr>
-      </w:pPr>
-      <w:r>
-        <w:rPr>
-          <w:b/>
-          <w:bCs/>
-          <w:sz w:val="28"/>
-          <w:szCs w:val="28"/>
-        </w:rPr>
-        <w:t>Indirekt adatkonzisztencia-ellenőrzés:</w:t>
-      </w:r>
-    </w:p>
-    <w:p>
-      <w:pPr>
-        <w:ind w:left="1416"/>
-      </w:pPr>
-      <w:r>
-        <w:t xml:space="preserve">Habár a </w:t>
-      </w:r>
-      <w:proofErr w:type="spellStart"/>
-      <w:r>
-        <w:t>Cypress</w:t>
-      </w:r>
-      <w:proofErr w:type="spellEnd"/>
-      <w:r>
-        <w:t xml:space="preserve"> a böngészőben fut, a háttérben többször ellenőriztem, az adatbázis kezelőben, hogy az adatok, amelyek a frontendről érkeztek helyesen </w:t>
-      </w:r>
-      <w:proofErr w:type="spellStart"/>
-      <w:r>
-        <w:t>tárolódtak</w:t>
-      </w:r>
-      <w:proofErr w:type="spellEnd"/>
-      <w:r>
-        <w:t>-e el, illetve a kizárólag adminisztrátor által látható felületek felé, az adatok megfelelően kerültek ki, a frontend számára.</w:t>
-      </w:r>
-    </w:p>
-    <w:p>
-      <w:pPr>
-        <w:ind w:left="1416"/>
-      </w:pPr>
-      <w:r>
-        <w:t>Ez a néhányszor megismételt ellenőrzési módszer kritikusnak bizonyult: Sikerült feltárnom és javítanom egy adatforgalmi anomáliát a szervizidőpontok kezelésénél biztosítva ezzel a pontos adatáramlást, a felhasználói és adminisztrátori felületek között.</w:t>
-      </w:r>
-    </w:p>
-    <w:p>
-      <w:pPr>
-        <w:pStyle w:val="Cmsor3"/>
-        <w:numPr>
-          <w:ilvl w:val="0"/>
-          <w:numId w:val="12"/>
-        </w:numPr>
-        <w:rPr>
-          <w:b/>
-          <w:bCs/>
-        </w:rPr>
-      </w:pPr>
-      <w:r>
-        <w:rPr>
-          <w:b/>
-          <w:bCs/>
-        </w:rPr>
-        <w:t>Diag</w:t>
-      </w:r>
-      <w:r>
-        <w:rPr>
-          <w:b/>
-          <w:bCs/>
-        </w:rPr>
-        <w:t xml:space="preserve">nosztikai eszközök használata: </w:t>
-      </w:r>
-    </w:p>
-    <w:p>
-      <w:pPr>
-        <w:ind w:left="1416"/>
-      </w:pPr>
-      <w:r>
-        <w:t>A tesztelés során több alkalommal is használtam a böngésző fejlesztői felületének „</w:t>
-      </w:r>
-      <w:proofErr w:type="spellStart"/>
-      <w:r>
-        <w:t>Elements</w:t>
-      </w:r>
-      <w:proofErr w:type="spellEnd"/>
-      <w:r>
-        <w:t>” nézetét, hogy a tesztelés során keresett elemet megtaláljam. A fejlesztés során a szemantikai szabályok betartása nem sikerült igazán. Így a böngésző fejlesztői felülete rendkívül hasznos volt számomra.</w:t>
-      </w:r>
-    </w:p>
-    <w:p/>
-    <w:p/>
-    <w:p/>
-    <w:p/>
-    <w:p>
-      <w:pPr>
-        <w:pStyle w:val="Cmsor3"/>
-        <w:numPr>
-          <w:ilvl w:val="0"/>
-          <w:numId w:val="12"/>
-        </w:numPr>
-        <w:rPr>
-          <w:b/>
-          <w:bCs/>
-        </w:rPr>
-      </w:pPr>
-      <w:r>
-        <w:rPr>
-          <w:b/>
-          <w:bCs/>
-        </w:rPr>
-        <w:t>Biztonság és útvonalvédelem verifikációja</w:t>
-      </w:r>
-      <w:r>
-        <w:rPr>
-          <w:b/>
-          <w:bCs/>
-        </w:rPr>
-        <w:t>:</w:t>
-      </w:r>
-    </w:p>
-    <w:p>
-      <w:pPr>
-        <w:ind w:left="1416"/>
-        <w:jc w:val="both"/>
-      </w:pPr>
-      <w:r>
-        <w:t xml:space="preserve">Ebben a részben az alkalmazás legkritikusabb helyein fellépő védelmeinek gyakorlati működését részletezem. A tesztelés során a jogosultságkezelés </w:t>
-      </w:r>
-      <w:r>
-        <w:lastRenderedPageBreak/>
-        <w:t>szigorú betartását vizsgáltam, két fő eseten keresztül.</w:t>
-      </w:r>
-      <w:r>
-        <w:t xml:space="preserve"> Jelen tesztesetekhez is a </w:t>
-      </w:r>
-      <w:proofErr w:type="spellStart"/>
-      <w:r>
-        <w:t>Cypresst</w:t>
-      </w:r>
-      <w:proofErr w:type="spellEnd"/>
-      <w:r>
-        <w:t xml:space="preserve"> használtam, így a tesztek bármikor reprodukálhatóak.</w:t>
-      </w:r>
-    </w:p>
-    <w:p>
-      <w:pPr>
-        <w:ind w:left="1416"/>
-        <w:jc w:val="both"/>
-      </w:pPr>
-    </w:p>
-    <w:p>
-      <w:pPr>
-        <w:pStyle w:val="Cmsor3"/>
-        <w:numPr>
-          <w:ilvl w:val="0"/>
-          <w:numId w:val="12"/>
-        </w:numPr>
-        <w:rPr>
-          <w:b/>
-          <w:bCs/>
-        </w:rPr>
-      </w:pPr>
-      <w:r>
-        <w:rPr>
-          <w:b/>
-          <w:bCs/>
-        </w:rPr>
-        <w:t>Adminisztrátori jogosultság ellenőrzése:</w:t>
-      </w:r>
-    </w:p>
-    <w:p>
-      <w:pPr>
-        <w:ind w:left="1416"/>
-        <w:jc w:val="both"/>
-      </w:pPr>
-      <w:r>
-        <w:t>A teszt célja, annak igazolása volt, hogy az adminisztrátori felületek közül egyik sem érhető el, semmilyen körülmények között illetéktelenek számára.</w:t>
-      </w:r>
-    </w:p>
-    <w:p>
-      <w:pPr>
-        <w:pStyle w:val="Listaszerbekezds"/>
-        <w:numPr>
-          <w:ilvl w:val="1"/>
-          <w:numId w:val="18"/>
-        </w:numPr>
-        <w:jc w:val="both"/>
-      </w:pPr>
-      <w:r>
-        <w:rPr>
-          <w:b/>
-          <w:bCs/>
-        </w:rPr>
-        <w:t xml:space="preserve">     </w:t>
-      </w:r>
-      <w:r>
-        <w:rPr>
-          <w:b/>
-          <w:bCs/>
-        </w:rPr>
-        <w:t xml:space="preserve">Automatizált folyamat: </w:t>
-      </w:r>
-      <w:r>
-        <w:t xml:space="preserve">A </w:t>
-      </w:r>
-      <w:proofErr w:type="spellStart"/>
-      <w:r>
-        <w:t>Cypress</w:t>
-      </w:r>
-      <w:proofErr w:type="spellEnd"/>
-      <w:r>
-        <w:t xml:space="preserve"> kijelentkezett állapotban próbálta elérni a </w:t>
-      </w:r>
-      <w:proofErr w:type="spellStart"/>
-      <w:r>
-        <w:t>visit</w:t>
-      </w:r>
-      <w:proofErr w:type="spellEnd"/>
-      <w:r>
-        <w:t>(„/</w:t>
-      </w:r>
-      <w:proofErr w:type="spellStart"/>
-      <w:r>
-        <w:t>admin</w:t>
-      </w:r>
-      <w:proofErr w:type="spellEnd"/>
-      <w:r>
-        <w:t xml:space="preserve">”) parancs segítségével az </w:t>
-      </w:r>
-      <w:proofErr w:type="spellStart"/>
-      <w:r>
-        <w:t>admin</w:t>
-      </w:r>
-      <w:proofErr w:type="spellEnd"/>
-      <w:r>
-        <w:t xml:space="preserve"> felületet.</w:t>
-      </w:r>
-    </w:p>
-    <w:p>
-      <w:pPr>
-        <w:pStyle w:val="Listaszerbekezds"/>
-        <w:ind w:left="1440"/>
-        <w:jc w:val="both"/>
-      </w:pPr>
-    </w:p>
-    <w:p>
-      <w:pPr>
-        <w:pStyle w:val="Listaszerbekezds"/>
-        <w:numPr>
-          <w:ilvl w:val="1"/>
-          <w:numId w:val="18"/>
-        </w:numPr>
-        <w:jc w:val="both"/>
-      </w:pPr>
-      <w:r>
-        <w:rPr>
-          <w:b/>
-          <w:bCs/>
-        </w:rPr>
-        <w:t xml:space="preserve">     </w:t>
-      </w:r>
-      <w:r>
-        <w:rPr>
-          <w:b/>
-          <w:bCs/>
-        </w:rPr>
-        <w:t xml:space="preserve">Várt és tapasztalt eredmény: </w:t>
-      </w:r>
-      <w:r>
-        <w:t xml:space="preserve">A teszt során a </w:t>
-      </w:r>
-      <w:proofErr w:type="spellStart"/>
-      <w:r>
-        <w:t>Cypress</w:t>
-      </w:r>
-      <w:proofErr w:type="spellEnd"/>
-      <w:r>
-        <w:t xml:space="preserve"> „</w:t>
-      </w:r>
-      <w:proofErr w:type="spellStart"/>
-      <w:r>
-        <w:t>url</w:t>
-      </w:r>
-      <w:proofErr w:type="spellEnd"/>
-      <w:r>
-        <w:t>()</w:t>
-      </w:r>
-      <w:proofErr w:type="spellStart"/>
-      <w:r>
-        <w:t>should</w:t>
-      </w:r>
-      <w:proofErr w:type="spellEnd"/>
-      <w:r>
-        <w:t>(’</w:t>
-      </w:r>
-      <w:proofErr w:type="spellStart"/>
-      <w:r>
-        <w:t>include</w:t>
-      </w:r>
-      <w:proofErr w:type="spellEnd"/>
-      <w:r>
-        <w:t xml:space="preserve">’, ’/login’)” parancsával ellenőriztem, hogy az alkalmazás, azonnal (még a komponens </w:t>
-      </w:r>
-      <w:proofErr w:type="spellStart"/>
-      <w:r>
-        <w:t>renderelése</w:t>
-      </w:r>
-      <w:proofErr w:type="spellEnd"/>
-      <w:r>
-        <w:t xml:space="preserve"> előtt) </w:t>
-      </w:r>
-      <w:proofErr w:type="spellStart"/>
-      <w:r>
-        <w:t>átírányítja</w:t>
-      </w:r>
-      <w:proofErr w:type="spellEnd"/>
-      <w:r>
-        <w:t xml:space="preserve"> a felhasználót, a bejelentkezés oldalra.</w:t>
-      </w:r>
-    </w:p>
-    <w:p>
-      <w:pPr>
-        <w:pStyle w:val="Listaszerbekezds"/>
-      </w:pPr>
-    </w:p>
-    <w:p>
-      <w:pPr>
-        <w:pStyle w:val="Listaszerbekezds"/>
-        <w:numPr>
-          <w:ilvl w:val="1"/>
-          <w:numId w:val="18"/>
-        </w:numPr>
-        <w:jc w:val="both"/>
-      </w:pPr>
-      <w:r>
-        <w:rPr>
-          <w:b/>
-          <w:bCs/>
-        </w:rPr>
-        <w:t xml:space="preserve">    </w:t>
-      </w:r>
-      <w:r>
-        <w:rPr>
-          <w:b/>
-          <w:bCs/>
-        </w:rPr>
-        <w:t xml:space="preserve">Technikai jelentőség: </w:t>
-      </w:r>
-      <w:r>
-        <w:t xml:space="preserve">Ez igazolja, hogy az </w:t>
-      </w:r>
-      <w:proofErr w:type="spellStart"/>
-      <w:r>
-        <w:t>adminLoader</w:t>
-      </w:r>
-      <w:proofErr w:type="spellEnd"/>
-      <w:r>
-        <w:t xml:space="preserve"> </w:t>
-      </w:r>
-      <w:proofErr w:type="spellStart"/>
-      <w:r>
-        <w:t>guard</w:t>
-      </w:r>
-      <w:proofErr w:type="spellEnd"/>
-      <w:r>
-        <w:t xml:space="preserve"> aktívan figyeli a globális állapotot, és </w:t>
-      </w:r>
-      <w:proofErr w:type="spellStart"/>
-      <w:r>
-        <w:t>token</w:t>
-      </w:r>
-      <w:proofErr w:type="spellEnd"/>
-      <w:r>
-        <w:t xml:space="preserve">  hiányában, vagy  nem megfelelő jogosultsággal rendelkező felhasználó esetén megszakítja az útvonal kiszolgálását. </w:t>
-      </w:r>
-    </w:p>
-    <w:p>
-      <w:pPr>
-        <w:pStyle w:val="Cmsor3"/>
-        <w:numPr>
-          <w:ilvl w:val="0"/>
-          <w:numId w:val="12"/>
-        </w:numPr>
-        <w:rPr>
-          <w:b/>
-          <w:bCs/>
-        </w:rPr>
-      </w:pPr>
-      <w:r>
-        <w:rPr>
-          <w:b/>
-          <w:bCs/>
-        </w:rPr>
-        <w:t xml:space="preserve"> </w:t>
-      </w:r>
-      <w:r>
-        <w:rPr>
-          <w:b/>
-          <w:bCs/>
-        </w:rPr>
-        <w:t>Munkamenet-logika és visszaút-védelem:</w:t>
-      </w:r>
-    </w:p>
-    <w:p>
-      <w:pPr>
-        <w:ind w:left="1416"/>
-      </w:pPr>
-      <w:r>
-        <w:t>A teszteset azt logikai szabályt ellenőrizte, miszerint egy már bejelentkezett, felhasználó nem érheti el a vendég-specifikus oldalakat. (pl.: Bejelentkezés)</w:t>
-      </w:r>
-    </w:p>
-    <w:p>
-      <w:pPr>
-        <w:pStyle w:val="Listaszerbekezds"/>
-        <w:numPr>
-          <w:ilvl w:val="1"/>
-          <w:numId w:val="19"/>
-        </w:numPr>
-        <w:rPr>
-          <w:b/>
-          <w:bCs/>
-        </w:rPr>
-      </w:pPr>
-      <w:r>
-        <w:rPr>
-          <w:b/>
-          <w:bCs/>
-        </w:rPr>
-        <w:t xml:space="preserve"> </w:t>
-      </w:r>
-      <w:r>
-        <w:rPr>
-          <w:b/>
-          <w:bCs/>
-        </w:rPr>
-        <w:tab/>
-      </w:r>
-      <w:r>
-        <w:rPr>
-          <w:b/>
-          <w:bCs/>
-        </w:rPr>
-        <w:t>Automatizált folyamat:</w:t>
-      </w:r>
-      <w:r>
-        <w:rPr>
-          <w:b/>
-          <w:bCs/>
-        </w:rPr>
-        <w:t xml:space="preserve">  </w:t>
-      </w:r>
-      <w:r>
-        <w:t xml:space="preserve">A teszt script elsősorban végrehajtott egy sikeres bejelentkezési folyamatot, majd megkísérelte a </w:t>
-      </w:r>
-      <w:proofErr w:type="spellStart"/>
-      <w:r>
-        <w:t>visit</w:t>
-      </w:r>
-      <w:proofErr w:type="spellEnd"/>
-      <w:r>
-        <w:t>(’/login’) parancs futtatását.</w:t>
-      </w:r>
-    </w:p>
-    <w:p>
-      <w:pPr>
-        <w:pStyle w:val="Listaszerbekezds"/>
-        <w:ind w:left="1440"/>
-        <w:rPr>
-          <w:b/>
-          <w:bCs/>
-        </w:rPr>
-      </w:pPr>
-    </w:p>
-    <w:p>
-      <w:pPr>
-        <w:pStyle w:val="Listaszerbekezds"/>
-        <w:numPr>
-          <w:ilvl w:val="1"/>
-          <w:numId w:val="19"/>
-        </w:numPr>
-        <w:rPr>
-          <w:b/>
-          <w:bCs/>
-        </w:rPr>
-      </w:pPr>
-      <w:r>
-        <w:rPr>
-          <w:b/>
-          <w:bCs/>
-        </w:rPr>
-        <w:t xml:space="preserve"> </w:t>
-      </w:r>
-      <w:r>
-        <w:rPr>
-          <w:b/>
-          <w:bCs/>
-        </w:rPr>
-        <w:tab/>
-      </w:r>
-      <w:r>
-        <w:rPr>
-          <w:b/>
-          <w:bCs/>
-        </w:rPr>
-        <w:t xml:space="preserve">Várt és tapasztalt eredmény: </w:t>
-      </w:r>
-      <w:r>
-        <w:t xml:space="preserve">A </w:t>
-      </w:r>
-      <w:proofErr w:type="spellStart"/>
-      <w:r>
-        <w:t>Cypress</w:t>
-      </w:r>
-      <w:proofErr w:type="spellEnd"/>
-      <w:r>
-        <w:t xml:space="preserve"> segítségével igazoltam, hogy a rendszer észleli az aktív munkamenetet, és automatikusan visszairányítja a felhasználót, a kezdőoldalra.</w:t>
-      </w:r>
-    </w:p>
-    <w:p>
-      <w:pPr>
-        <w:pStyle w:val="Listaszerbekezds"/>
-        <w:ind w:left="1440"/>
-        <w:rPr>
-          <w:b/>
-          <w:bCs/>
-        </w:rPr>
-      </w:pPr>
-    </w:p>
-    <w:p>
-      <w:pPr>
-        <w:ind w:left="24"/>
-        <w:rPr>
-          <w:b/>
-          <w:bCs/>
-        </w:rPr>
-      </w:pPr>
-    </w:p>
-    <w:p>
-      <w:pPr>
-        <w:ind w:left="24"/>
-        <w:rPr>
-          <w:b/>
-          <w:bCs/>
-        </w:rPr>
-      </w:pPr>
-    </w:p>
-    <w:p>
-      <w:pPr>
-        <w:ind w:left="24"/>
-        <w:rPr>
-          <w:b/>
-          <w:bCs/>
-        </w:rPr>
-      </w:pPr>
-    </w:p>
-    <w:p>
-      <w:pPr>
         <w:rPr>
           <w:b/>
           <w:bCs/>
@@ -1138,7 +1310,7 @@
           <w:b/>
           <w:bCs/>
         </w:rPr>
-        <w:t>Reszponzivitás</w:t>
+        <w:t>Toast</w:t>
       </w:r>
       <w:proofErr w:type="spellEnd"/>
       <w:r>
@@ -1146,51 +1318,34 @@
           <w:b/>
           <w:bCs/>
         </w:rPr>
-        <w:t xml:space="preserve"> és </w:t>
-      </w:r>
-      <w:proofErr w:type="spellStart"/>
-      <w:r>
-        <w:rPr>
-          <w:b/>
-          <w:bCs/>
-        </w:rPr>
-        <w:t>Viewport</w:t>
-      </w:r>
-      <w:proofErr w:type="spellEnd"/>
-      <w:r>
-        <w:rPr>
-          <w:b/>
-          <w:bCs/>
-        </w:rPr>
-        <w:t xml:space="preserve"> tesztelés</w:t>
+        <w:t>-alapú aszinkron visszajelzések</w:t>
       </w:r>
     </w:p>
     <w:p>
       <w:pPr>
         <w:ind w:left="2124"/>
-        <w:jc w:val="both"/>
-      </w:pPr>
-      <w:r>
-        <w:t xml:space="preserve">A webshop modern elvárásaihoz igazodva elengedhetetlen volt a mobilbarát design ellenőrzése is. A tesztelés során a </w:t>
+      </w:pPr>
+      <w:r>
+        <w:t xml:space="preserve">A webshop egyik kulcsfontosságú UX eleme a </w:t>
       </w:r>
       <w:proofErr w:type="spellStart"/>
       <w:r>
-        <w:t>Cypress</w:t>
+        <w:t>ToastProvider</w:t>
       </w:r>
       <w:proofErr w:type="spellEnd"/>
       <w:r>
-        <w:t xml:space="preserve"> segítségével szimuláltam különböző </w:t>
+        <w:t>, amely néhány kulcsfontosságú felhasználói művelet eredményéről tájékoztatja az oldalra látogatókat.</w:t>
+      </w:r>
+      <w:r>
+        <w:t xml:space="preserve"> Bár a </w:t>
       </w:r>
       <w:proofErr w:type="spellStart"/>
       <w:r>
-        <w:t>kijelzőméretet</w:t>
+        <w:t>Toast</w:t>
       </w:r>
       <w:proofErr w:type="spellEnd"/>
       <w:r>
-        <w:t>. (IPhone XR</w:t>
-      </w:r>
-      <w:r>
-        <w:t>)</w:t>
+        <w:t xml:space="preserve">-üzenetek működésére nem írtam külön automatizált tesztet, a beépítésük után minden fontos folyamatnál manuálisan ellenőriztem a megjelenésüket. </w:t>
       </w:r>
     </w:p>
     <w:p>
@@ -1198,71 +1353,107 @@
         <w:pStyle w:val="Listaszerbekezds"/>
         <w:numPr>
           <w:ilvl w:val="1"/>
-          <w:numId w:val="21"/>
+          <w:numId w:val="22"/>
         </w:numPr>
-        <w:jc w:val="both"/>
-        <w:rPr>
-          <w:b/>
-          <w:bCs/>
-        </w:rPr>
-      </w:pPr>
-      <w:r>
-        <w:rPr>
-          <w:b/>
-          <w:bCs/>
-        </w:rPr>
-        <w:lastRenderedPageBreak/>
-        <w:t xml:space="preserve">Vizuális átrendeződés: </w:t>
-      </w:r>
-      <w:r>
-        <w:t xml:space="preserve">Ellenőriztem, hogy a főoldalon található </w:t>
-      </w:r>
-      <w:proofErr w:type="spellStart"/>
-      <w:r>
-        <w:t>Flowbite-React</w:t>
-      </w:r>
-      <w:proofErr w:type="spellEnd"/>
-      <w:r>
-        <w:t xml:space="preserve"> komponensek (Nav</w:t>
-      </w:r>
-      <w:r>
-        <w:t>igációs sáv</w:t>
-      </w:r>
-      <w:r>
-        <w:t xml:space="preserve">, keresés űrlap, termékkártyák) megfelelően alkalmazkodnak a kisebb kijelzőkhöz. Elsősorban a </w:t>
-      </w:r>
-      <w:r>
-        <w:t>Navigációs sáv</w:t>
-      </w:r>
-      <w:r>
-        <w:t xml:space="preserve"> hamburger menübe való </w:t>
-      </w:r>
-      <w:proofErr w:type="spellStart"/>
-      <w:r>
-        <w:t>csoportulását</w:t>
-      </w:r>
-      <w:proofErr w:type="spellEnd"/>
-      <w:r>
-        <w:t xml:space="preserve"> ellenőriztem, ezzel biztosítva a könnyű kezelhetőséget.</w:t>
+      </w:pPr>
+      <w:r>
+        <w:rPr>
+          <w:b/>
+          <w:bCs/>
+        </w:rPr>
+        <w:t xml:space="preserve"> </w:t>
+      </w:r>
+      <w:r>
+        <w:rPr>
+          <w:b/>
+          <w:bCs/>
+        </w:rPr>
+        <w:t xml:space="preserve"> </w:t>
+      </w:r>
+      <w:r>
+        <w:rPr>
+          <w:b/>
+          <w:bCs/>
+        </w:rPr>
+        <w:t xml:space="preserve">Sikeres folyamatok visszajelzése: </w:t>
+      </w:r>
+      <w:r>
+        <w:t xml:space="preserve"> Teszteltem, hogy sikeres regisztráció, bejelentkezés vagy szervizidőpont foglalás esetén megjelenik a zöld szín különböző árnyalataival ellátott, megerősítő üzenet.</w:t>
       </w:r>
     </w:p>
     <w:p>
       <w:pPr>
         <w:pStyle w:val="Listaszerbekezds"/>
-        <w:ind w:left="2484"/>
-        <w:jc w:val="both"/>
-        <w:rPr>
-          <w:b/>
-          <w:bCs/>
-        </w:rPr>
-      </w:pPr>
+        <w:ind w:left="2121"/>
+      </w:pPr>
+      <w:r>
+        <w:t xml:space="preserve"> </w:t>
+      </w:r>
     </w:p>
     <w:p>
       <w:pPr>
         <w:pStyle w:val="Listaszerbekezds"/>
         <w:numPr>
           <w:ilvl w:val="1"/>
-          <w:numId w:val="21"/>
+          <w:numId w:val="22"/>
+        </w:numPr>
+      </w:pPr>
+      <w:r>
+        <w:rPr>
+          <w:b/>
+          <w:bCs/>
+        </w:rPr>
+        <w:t xml:space="preserve">  </w:t>
+      </w:r>
+      <w:r>
+        <w:rPr>
+          <w:b/>
+          <w:bCs/>
+        </w:rPr>
+        <w:t>Hibaágak visszajelzése:</w:t>
+      </w:r>
+      <w:r>
+        <w:t xml:space="preserve"> Szándékos hiba esetén, (pl.: rossz jelszó, üres hiba leírás), hogy a piros hibaüzenet megjelenik-e az adott űrlapon, ezzel egyértelmű választ adva a felhasználónak, hogy a művelet nem sikerült. </w:t>
+      </w:r>
+    </w:p>
+    <w:p>
+      <w:pPr>
+        <w:pStyle w:val="Listaszerbekezds"/>
+        <w:ind w:left="2121"/>
+      </w:pPr>
+    </w:p>
+    <w:p>
+      <w:pPr>
+        <w:pStyle w:val="Listaszerbekezds"/>
+        <w:numPr>
+          <w:ilvl w:val="1"/>
+          <w:numId w:val="22"/>
+        </w:numPr>
+      </w:pPr>
+      <w:r>
+        <w:rPr>
+          <w:b/>
+          <w:bCs/>
+        </w:rPr>
+        <w:t xml:space="preserve">  </w:t>
+      </w:r>
+      <w:r>
+        <w:rPr>
+          <w:b/>
+          <w:bCs/>
+        </w:rPr>
+        <w:t>Jelentőség:</w:t>
+      </w:r>
+      <w:r>
+        <w:t xml:space="preserve"> A manuális tesztelések során megbizonyosodtam róla, hogy az üzenetek elég ideig láthatóak, de nem zavarják a további böngészést.</w:t>
+      </w:r>
+    </w:p>
+    <w:p>
+      <w:pPr>
+        <w:pStyle w:val="Cmsor3"/>
+        <w:numPr>
+          <w:ilvl w:val="1"/>
+          <w:numId w:val="22"/>
         </w:numPr>
         <w:jc w:val="both"/>
         <w:rPr>
@@ -1275,33 +1466,20 @@
           <w:b/>
           <w:bCs/>
         </w:rPr>
-        <w:t xml:space="preserve">Interakciók: </w:t>
-      </w:r>
-      <w:r>
-        <w:t xml:space="preserve">Továbbá vizsgáltam, </w:t>
-      </w:r>
-      <w:proofErr w:type="spellStart"/>
-      <w:r>
-        <w:t>érintőkijelzős</w:t>
-      </w:r>
-      <w:proofErr w:type="spellEnd"/>
-      <w:r>
-        <w:t xml:space="preserve"> használatot szimulálva a gombok elérhetőek-e, láthatóak-e, és nem fordul-e elő az elemek egymásra vagy elcsúszása, különösen a </w:t>
-      </w:r>
-      <w:r>
-        <w:t xml:space="preserve">Navigációs sáv </w:t>
-      </w:r>
-      <w:r>
-        <w:t>komponens esetében.</w:t>
+        <w:t>Betöltési állapotok</w:t>
       </w:r>
     </w:p>
     <w:p>
       <w:pPr>
-        <w:pStyle w:val="Listaszerbekezds"/>
-        <w:rPr>
-          <w:b/>
-          <w:bCs/>
-        </w:rPr>
+        <w:ind w:left="2124"/>
+      </w:pPr>
+      <w:r>
+        <w:t xml:space="preserve">Vizsgáltam továbbá, hogy az aszinkron műveletek (pl.: rendelés leadása, bejelentkezés) közben a rendszer ad-e, visszajelzést. Ellenőriztem, hogy a gombok állapota megváltozik-e, amíg a kérés zajlik, megakadályozva ezzel, hogy a felhasználó többször küldje el ugyanazt a kérést a szerver felé. </w:t>
+      </w:r>
+    </w:p>
+    <w:p>
+      <w:pPr>
+        <w:ind w:left="2124"/>
       </w:pPr>
     </w:p>
     <w:p>
@@ -1322,185 +1500,104 @@
           <w:b/>
           <w:bCs/>
         </w:rPr>
-        <w:t xml:space="preserve"> </w:t>
-      </w:r>
-      <w:proofErr w:type="spellStart"/>
-      <w:r>
-        <w:rPr>
-          <w:b/>
-          <w:bCs/>
-        </w:rPr>
-        <w:t>Toast</w:t>
-      </w:r>
-      <w:proofErr w:type="spellEnd"/>
-      <w:r>
-        <w:rPr>
-          <w:b/>
-          <w:bCs/>
-        </w:rPr>
-        <w:t>-alapú aszinkron visszajelzések</w:t>
+        <w:t xml:space="preserve">  </w:t>
+      </w:r>
+      <w:r>
+        <w:rPr>
+          <w:b/>
+          <w:bCs/>
+        </w:rPr>
+        <w:t>A tesztelés és a fejlesztés kapcsolata</w:t>
       </w:r>
     </w:p>
     <w:p>
       <w:pPr>
-        <w:ind w:left="2124"/>
-      </w:pPr>
-      <w:r>
-        <w:t xml:space="preserve">A webshop egyik kulcsfontosságú UX eleme a </w:t>
-      </w:r>
-      <w:proofErr w:type="spellStart"/>
-      <w:r>
-        <w:t>ToastProvider</w:t>
-      </w:r>
-      <w:proofErr w:type="spellEnd"/>
-      <w:r>
-        <w:t>, amely néhány kulcsfontosságú felhasználói művelet eredményéről tájékoztatja az oldalra látogatókat.</w:t>
-      </w:r>
-      <w:r>
-        <w:t xml:space="preserve"> Bár a </w:t>
-      </w:r>
-      <w:proofErr w:type="spellStart"/>
-      <w:r>
-        <w:t>Toast</w:t>
-      </w:r>
-      <w:proofErr w:type="spellEnd"/>
-      <w:r>
-        <w:t xml:space="preserve">-üzenetek működésére nem írtam külön automatizált tesztet, a beépítésük után minden fontos folyamatnál manuálisan ellenőriztem a megjelenésüket. </w:t>
+        <w:ind w:left="1416"/>
+      </w:pPr>
+      <w:r>
+        <w:t xml:space="preserve">A tesztelés folyamata rávilágított, továbbfejlesztési lehetőségekre, illetve több súlyos hiba felismerését is elősegítette a frontend oldalon. Ezeket a tesztelési folyamat során javítottam az automatizált tesztek írása mellett. </w:t>
       </w:r>
     </w:p>
     <w:p>
       <w:pPr>
-        <w:pStyle w:val="Listaszerbekezds"/>
-        <w:numPr>
-          <w:ilvl w:val="1"/>
-          <w:numId w:val="22"/>
-        </w:numPr>
-      </w:pPr>
-      <w:r>
-        <w:rPr>
-          <w:b/>
-          <w:bCs/>
-        </w:rPr>
+        <w:ind w:left="1416"/>
+      </w:pPr>
+      <w:r>
+        <w:lastRenderedPageBreak/>
+        <w:t xml:space="preserve">A legfontosabb hiba, amelyet a tesztelési folyamat során felismertem a szerviz szekcióban, lévő HTML </w:t>
+      </w:r>
+      <w:proofErr w:type="spellStart"/>
+      <w:r>
+        <w:t>textarea</w:t>
+      </w:r>
+      <w:proofErr w:type="spellEnd"/>
+      <w:r>
         <w:t xml:space="preserve"> </w:t>
       </w:r>
-      <w:r>
-        <w:rPr>
-          <w:b/>
-          <w:bCs/>
-        </w:rPr>
-        <w:t xml:space="preserve"> </w:t>
-      </w:r>
-      <w:r>
-        <w:rPr>
-          <w:b/>
-          <w:bCs/>
-        </w:rPr>
-        <w:t xml:space="preserve">Sikeres folyamatok visszajelzése: </w:t>
-      </w:r>
-      <w:r>
-        <w:t xml:space="preserve"> Teszteltem, hogy sikeres regisztráció, bejelentkezés vagy szervizidőpont foglalás esetén megjelenik a zöld szín különböző árnyalataival ellátott, megerősítő üzenet.</w:t>
+      <w:proofErr w:type="spellStart"/>
+      <w:r>
+        <w:t>name</w:t>
+      </w:r>
+      <w:proofErr w:type="spellEnd"/>
+      <w:r>
+        <w:t xml:space="preserve"> attribútumának fejlesztés során rosszul megadott értéke volt. Ezt több, mint egy órás kutatás sikerült észrevételeznem, a hiba javítása, pedig nem vett több időt igénybe 5 percnél. </w:t>
       </w:r>
     </w:p>
     <w:p>
       <w:pPr>
-        <w:pStyle w:val="Listaszerbekezds"/>
-        <w:ind w:left="2121"/>
-      </w:pPr>
-      <w:r>
-        <w:t xml:space="preserve"> </w:t>
+        <w:ind w:left="1416"/>
+      </w:pPr>
+      <w:r>
+        <w:t xml:space="preserve">Összeségében elmondható, hogy a </w:t>
+      </w:r>
+      <w:proofErr w:type="spellStart"/>
+      <w:r>
+        <w:t>Cypress</w:t>
+      </w:r>
+      <w:proofErr w:type="spellEnd"/>
+      <w:r>
+        <w:t xml:space="preserve">, illetve a böngésző fejlesztői eszközök ablak segítségével, egyik hiba felismerésének ideje sem volt több 1 óránál. </w:t>
       </w:r>
     </w:p>
     <w:p>
       <w:pPr>
-        <w:pStyle w:val="Listaszerbekezds"/>
-        <w:numPr>
-          <w:ilvl w:val="1"/>
-          <w:numId w:val="22"/>
-        </w:numPr>
-      </w:pPr>
-      <w:r>
-        <w:rPr>
-          <w:b/>
-          <w:bCs/>
-        </w:rPr>
-        <w:t xml:space="preserve">  </w:t>
-      </w:r>
-      <w:r>
-        <w:rPr>
-          <w:b/>
-          <w:bCs/>
-        </w:rPr>
-        <w:t>Hibaágak visszajelzése:</w:t>
-      </w:r>
-      <w:r>
-        <w:t xml:space="preserve"> Szándékos hiba esetén, (pl.: rossz jelszó, üres hiba leírás), hogy a piros hibaüzenet megjelenik-e az adott űrlapon, ezzel egyértelmű választ adva a felhasználónak, hogy a művelet nem sikerült. </w:t>
+        <w:ind w:left="1416"/>
+      </w:pPr>
+      <w:r>
+        <w:t xml:space="preserve">A </w:t>
+      </w:r>
+      <w:proofErr w:type="spellStart"/>
+      <w:r>
+        <w:t>Cypress</w:t>
+      </w:r>
+      <w:proofErr w:type="spellEnd"/>
+      <w:r>
+        <w:t xml:space="preserve"> könnyen használható kezelőfelülete, rendkívül megkönnyítette a dolgom a tesztesetek kezelésében, illetve a hibakeresésben is.</w:t>
       </w:r>
     </w:p>
     <w:p>
       <w:pPr>
-        <w:pStyle w:val="Listaszerbekezds"/>
-        <w:ind w:left="2121"/>
-      </w:pPr>
-    </w:p>
-    <w:p>
-      <w:pPr>
-        <w:pStyle w:val="Listaszerbekezds"/>
-        <w:numPr>
-          <w:ilvl w:val="1"/>
-          <w:numId w:val="22"/>
-        </w:numPr>
-      </w:pPr>
-      <w:r>
-        <w:rPr>
-          <w:b/>
-          <w:bCs/>
-        </w:rPr>
-        <w:t xml:space="preserve">  </w:t>
-      </w:r>
-      <w:r>
-        <w:rPr>
-          <w:b/>
-          <w:bCs/>
-        </w:rPr>
-        <w:t>Jelentőség:</w:t>
-      </w:r>
-      <w:r>
-        <w:t xml:space="preserve"> A manuális tesztelések során megbizonyosodtam róla, hogy az üzenetek elég ideig láthatóak, de nem zavarják a további böngészést.</w:t>
-      </w:r>
-    </w:p>
-    <w:p>
-      <w:pPr>
-        <w:pStyle w:val="Cmsor3"/>
-        <w:numPr>
-          <w:ilvl w:val="1"/>
-          <w:numId w:val="22"/>
-        </w:numPr>
-        <w:jc w:val="both"/>
-        <w:rPr>
-          <w:b/>
-          <w:bCs/>
-        </w:rPr>
-      </w:pPr>
-      <w:r>
-        <w:rPr>
-          <w:b/>
-          <w:bCs/>
-        </w:rPr>
-        <w:t>Betöltési állapotok</w:t>
-      </w:r>
-    </w:p>
-    <w:p>
-      <w:pPr>
-        <w:ind w:left="2124"/>
-      </w:pPr>
-      <w:r>
-        <w:t xml:space="preserve">Vizsgáltam továbbá, hogy az aszinkron műveletek (pl.: rendelés leadása, bejelentkezés) közben a rendszer ad-e, visszajelzést. Ellenőriztem, hogy a gombok állapota megváltozik-e, amíg a kérés zajlik, megakadályozva ezzel, hogy a felhasználó többször küldje el ugyanazt a kérést a szerver felé. </w:t>
-      </w:r>
-    </w:p>
-    <w:p>
-      <w:pPr>
-        <w:ind w:left="2124"/>
-      </w:pPr>
+        <w:ind w:left="1416"/>
+      </w:pPr>
+      <w:r>
+        <w:t xml:space="preserve">Ugyanakkor a tesztelés elején félelemmel vágtam bele, mivel rendkívül rossz tapasztalatokat adott a </w:t>
+      </w:r>
+      <w:proofErr w:type="spellStart"/>
+      <w:r>
+        <w:t>Cypress</w:t>
+      </w:r>
+      <w:proofErr w:type="spellEnd"/>
+      <w:r>
+        <w:t xml:space="preserve"> keretrendszer a tanórai kereteken belül, ahol REST </w:t>
+      </w:r>
+      <w:proofErr w:type="spellStart"/>
+      <w:r>
+        <w:t>api</w:t>
+      </w:r>
+      <w:proofErr w:type="spellEnd"/>
+      <w:r>
+        <w:t xml:space="preserve"> végpontok tesztelésére használtuk. Azonban számomra rendkívül pozitív csalódás volt, a keretrendszer használata a frontend tesztelés esetében.  </w:t>
+      </w:r>
     </w:p>
     <w:p>
       <w:pPr>
@@ -1509,26 +1606,17 @@
           <w:ilvl w:val="0"/>
           <w:numId w:val="12"/>
         </w:numPr>
-        <w:jc w:val="both"/>
-        <w:rPr>
-          <w:b/>
-          <w:bCs/>
-        </w:rPr>
-      </w:pPr>
-      <w:r>
-        <w:rPr>
-          <w:b/>
-          <w:bCs/>
-        </w:rPr>
-        <w:lastRenderedPageBreak/>
-        <w:t xml:space="preserve">  </w:t>
-      </w:r>
-      <w:r>
-        <w:rPr>
-          <w:b/>
-          <w:bCs/>
-        </w:rPr>
-        <w:t>A tesztelés és a fejlesztés kapcsolata</w:t>
+        <w:rPr>
+          <w:b/>
+          <w:bCs/>
+        </w:rPr>
+      </w:pPr>
+      <w:r>
+        <w:rPr>
+          <w:b/>
+          <w:bCs/>
+        </w:rPr>
+        <w:t>Automatizált és Manuális tesztelésről</w:t>
       </w:r>
     </w:p>
     <w:p>
@@ -1536,7 +1624,15 @@
         <w:ind w:left="1416"/>
       </w:pPr>
       <w:r>
-        <w:t xml:space="preserve">A tesztelés folyamata rávilágított, továbbfejlesztési lehetőségekre, illetve több súlyos hiba felismerését is elősegítette a frontend oldalon. Ezeket a tesztelési folyamat során javítottam az automatizált tesztek írása mellett. </w:t>
+        <w:t xml:space="preserve">A </w:t>
+      </w:r>
+      <w:proofErr w:type="spellStart"/>
+      <w:r>
+        <w:t>Cypress</w:t>
+      </w:r>
+      <w:proofErr w:type="spellEnd"/>
+      <w:r>
+        <w:t xml:space="preserve"> beállítása rendkívül könnyű volt, hiszen csak a keresett URL-t kellett megadni, a keretrendszer számára, majd ezután volt lehetőségem rövidebb URL címeket használni a teszt scriptek megvalósítása közben. </w:t>
       </w:r>
     </w:p>
     <w:p>
@@ -1544,23 +1640,23 @@
         <w:ind w:left="1416"/>
       </w:pPr>
       <w:r>
-        <w:t xml:space="preserve">A legfontosabb hiba, amelyet a tesztelési folyamat során felismertem a szerviz szekcióban, lévő HTML </w:t>
+        <w:t>Emellett a tesztelés során többször felismertem, hogy több ismétlődő folyamat is jelen van bizonyos összetett tesztesetekben. Ezt figyelembe véve, további tesztesetek definiálása esetén, érdemes lenne különböző feladatokba(</w:t>
       </w:r>
       <w:proofErr w:type="spellStart"/>
       <w:r>
-        <w:t>textarea</w:t>
+        <w:t>taskokba</w:t>
       </w:r>
       <w:proofErr w:type="spellEnd"/>
       <w:r>
-        <w:t xml:space="preserve"> </w:t>
+        <w:t xml:space="preserve">), kiszervezni a </w:t>
       </w:r>
       <w:proofErr w:type="spellStart"/>
       <w:r>
-        <w:t>name</w:t>
+        <w:t>Cypress</w:t>
       </w:r>
       <w:proofErr w:type="spellEnd"/>
       <w:r>
-        <w:t xml:space="preserve"> attribútumának fejlesztés során rosszul megadott értéke volt. Ezt több, mint egy órás kutatás sikerült észrevételeznem, a hiba javítása, pedig nem vett több időt igénybe 5 percnél. </w:t>
+        <w:t xml:space="preserve"> konfigurációs fájljában az ismétlődő folyamatokat.</w:t>
       </w:r>
     </w:p>
     <w:p>
@@ -1568,15 +1664,13 @@
         <w:ind w:left="1416"/>
       </w:pPr>
       <w:r>
-        <w:t xml:space="preserve">Összeségében elmondható, hogy a </w:t>
-      </w:r>
-      <w:proofErr w:type="spellStart"/>
-      <w:r>
-        <w:t>Cypress</w:t>
-      </w:r>
-      <w:proofErr w:type="spellEnd"/>
-      <w:r>
-        <w:t xml:space="preserve">, illetve a böngésző fejlesztői eszközök ablak segítségével, egyik hiba felismerésének ideje sem volt több 1 óránál. </w:t>
+        <w:t xml:space="preserve">A különböző </w:t>
+      </w:r>
+      <w:r>
+        <w:t>UX-szel</w:t>
+      </w:r>
+      <w:r>
+        <w:t xml:space="preserve"> kapcsolatos teszteket, manuálisan végeztem, többek között, mivel a felhasználói dokumentációban, szintén megjelennek ezek a folyamatok képernyőképek, illetve leírások formájában.</w:t>
       </w:r>
     </w:p>
     <w:p>
@@ -1584,40 +1678,29 @@
         <w:ind w:left="1416"/>
       </w:pPr>
       <w:r>
-        <w:t xml:space="preserve">A </w:t>
-      </w:r>
-      <w:proofErr w:type="spellStart"/>
-      <w:r>
-        <w:t>Cypress</w:t>
-      </w:r>
-      <w:proofErr w:type="spellEnd"/>
-      <w:r>
-        <w:t xml:space="preserve"> könnyen használható kezelőfelülete, rendkívül megkönnyítette a dolgom a tesztesetek kezelésében, illetve a hibakeresésben is.</w:t>
+        <w:t xml:space="preserve">Az összetett folyamatok, kiválogatásra kerültek, egy </w:t>
+      </w:r>
+      <w:r>
+        <w:t>táblázatba,</w:t>
+      </w:r>
+      <w:r>
+        <w:t xml:space="preserve"> amely segítségével roppant egyszerű volt az automatizált tesztek megvalósítása, illetve többszöri bővítése is.</w:t>
       </w:r>
     </w:p>
     <w:p>
       <w:pPr>
         <w:ind w:left="1416"/>
       </w:pPr>
-      <w:r>
-        <w:t xml:space="preserve">Ugyanakkor a tesztelés elején félelemmel vágtam bele, mivel rendkívül rossz tapasztalatokat adott a </w:t>
-      </w:r>
-      <w:proofErr w:type="spellStart"/>
-      <w:r>
-        <w:t>Cypress</w:t>
-      </w:r>
-      <w:proofErr w:type="spellEnd"/>
-      <w:r>
-        <w:t xml:space="preserve"> keretrendszer a tanórai kereteken belül, ahol REST </w:t>
-      </w:r>
-      <w:proofErr w:type="spellStart"/>
-      <w:r>
-        <w:t>api</w:t>
-      </w:r>
-      <w:proofErr w:type="spellEnd"/>
-      <w:r>
-        <w:t xml:space="preserve"> végpontok tesztelésére használtuk. Azonban számomra rendkívül pozitív csalódás volt, a keretrendszer használata a frontend tesztelés esetében.  </w:t>
-      </w:r>
+    </w:p>
+    <w:p>
+      <w:pPr>
+        <w:ind w:left="1416"/>
+      </w:pPr>
+    </w:p>
+    <w:p>
+      <w:pPr>
+        <w:ind w:left="1416"/>
+      </w:pPr>
     </w:p>
     <w:p>
       <w:pPr>
@@ -1636,110 +1719,6 @@
           <w:b/>
           <w:bCs/>
         </w:rPr>
-        <w:t>Automatizált és Manuális tesztelésről</w:t>
-      </w:r>
-    </w:p>
-    <w:p>
-      <w:pPr>
-        <w:ind w:left="1416"/>
-      </w:pPr>
-      <w:r>
-        <w:t xml:space="preserve">A </w:t>
-      </w:r>
-      <w:proofErr w:type="spellStart"/>
-      <w:r>
-        <w:t>Cypress</w:t>
-      </w:r>
-      <w:proofErr w:type="spellEnd"/>
-      <w:r>
-        <w:t xml:space="preserve"> beállítása rendkívül könnyű volt, hiszen csak a keresett URL-t kellett megadni, a keretrendszer számára, majd ezután volt lehetőségem rövidebb URL címeket használni a teszt scriptek megvalósítása közben. </w:t>
-      </w:r>
-    </w:p>
-    <w:p>
-      <w:pPr>
-        <w:ind w:left="1416"/>
-      </w:pPr>
-      <w:r>
-        <w:t>Emellett a tesztelés során többször felismertem, hogy több ismétlődő folyamat is jelen van bizonyos összetett tesztesetekben. Ezt figyelembe véve, további tesztesetek definiálása esetén, érdemes lenne különböző feladatokba(</w:t>
-      </w:r>
-      <w:proofErr w:type="spellStart"/>
-      <w:r>
-        <w:t>taskokba</w:t>
-      </w:r>
-      <w:proofErr w:type="spellEnd"/>
-      <w:r>
-        <w:t xml:space="preserve">), kiszervezni a </w:t>
-      </w:r>
-      <w:proofErr w:type="spellStart"/>
-      <w:r>
-        <w:t>Cypress</w:t>
-      </w:r>
-      <w:proofErr w:type="spellEnd"/>
-      <w:r>
-        <w:t xml:space="preserve"> konfigurációs fájljában az ismétlődő folyamatokat.</w:t>
-      </w:r>
-    </w:p>
-    <w:p>
-      <w:pPr>
-        <w:ind w:left="1416"/>
-      </w:pPr>
-      <w:r>
-        <w:t xml:space="preserve">A különböző </w:t>
-      </w:r>
-      <w:r>
-        <w:t>UX-szel</w:t>
-      </w:r>
-      <w:r>
-        <w:t xml:space="preserve"> kapcsolatos teszteket, manuálisan végeztem, többek között, mivel a felhasználói dokumentációban, szintén megjelennek ezek a folyamatok képernyőképek, illetve leírások formájában.</w:t>
-      </w:r>
-    </w:p>
-    <w:p>
-      <w:pPr>
-        <w:ind w:left="1416"/>
-      </w:pPr>
-      <w:r>
-        <w:t xml:space="preserve">Az összetett folyamatok, kiválogatásra kerültek, egy </w:t>
-      </w:r>
-      <w:r>
-        <w:t>táblázatba,</w:t>
-      </w:r>
-      <w:r>
-        <w:t xml:space="preserve"> amely segítségével roppant egyszerű volt az automatizált tesztek megvalósítása, illetve többszöri bővítése is.</w:t>
-      </w:r>
-    </w:p>
-    <w:p>
-      <w:pPr>
-        <w:ind w:left="1416"/>
-      </w:pPr>
-    </w:p>
-    <w:p>
-      <w:pPr>
-        <w:ind w:left="1416"/>
-      </w:pPr>
-    </w:p>
-    <w:p>
-      <w:pPr>
-        <w:ind w:left="1416"/>
-      </w:pPr>
-    </w:p>
-    <w:p>
-      <w:pPr>
-        <w:pStyle w:val="Cmsor3"/>
-        <w:numPr>
-          <w:ilvl w:val="0"/>
-          <w:numId w:val="12"/>
-        </w:numPr>
-        <w:rPr>
-          <w:b/>
-          <w:bCs/>
-        </w:rPr>
-      </w:pPr>
-      <w:r>
-        <w:rPr>
-          <w:b/>
-          <w:bCs/>
-        </w:rPr>
-        <w:lastRenderedPageBreak/>
         <w:t xml:space="preserve"> </w:t>
       </w:r>
       <w:r>
@@ -4259,10 +4238,7 @@
               <w:t>) – Felhasználó kereső űrlapba felhasználónév részleges vagy teljes megadása</w:t>
             </w:r>
             <w:r>
-              <w:t xml:space="preserve"> - </w:t>
-            </w:r>
-            <w:r>
-              <w:t>kattint a keresés gombra</w:t>
+              <w:t xml:space="preserve"> - kattint a keresés gombra</w:t>
             </w:r>
           </w:p>
         </w:tc>
@@ -4362,10 +4338,7 @@
               <w:t xml:space="preserve"> oldalra) -  Termék kereső űrlapba terméknév részleges vagy teljes megadása</w:t>
             </w:r>
             <w:r>
-              <w:t xml:space="preserve"> - </w:t>
-            </w:r>
-            <w:r>
-              <w:t>kattint a keresés gombra</w:t>
+              <w:t xml:space="preserve"> - kattint a keresés gombra</w:t>
             </w:r>
           </w:p>
         </w:tc>
@@ -5133,7 +5106,7 @@
   <w:abstractNum w:abstractNumId="4" w15:restartNumberingAfterBreak="0">
     <w:nsid w:val="2E8C6C63"/>
     <w:multiLevelType w:val="hybridMultilevel"/>
-    <w:tmpl w:val="7696F996"/>
+    <w:tmpl w:val="AC2C8D44"/>
     <w:lvl w:ilvl="0" w:tplc="040E000F">
       <w:start w:val="1"/>
       <w:numFmt w:val="decimal"/>
@@ -5827,6 +5800,119 @@
     </w:lvl>
   </w:abstractNum>
   <w:abstractNum w:abstractNumId="10" w15:restartNumberingAfterBreak="0">
+    <w:nsid w:val="50883937"/>
+    <w:multiLevelType w:val="multilevel"/>
+    <w:tmpl w:val="4B6AA1E4"/>
+    <w:lvl w:ilvl="0">
+      <w:start w:val="1"/>
+      <w:numFmt w:val="decimal"/>
+      <w:lvlText w:val="%1"/>
+      <w:lvlJc w:val="left"/>
+      <w:pPr>
+        <w:ind w:left="360" w:hanging="360"/>
+      </w:pPr>
+      <w:rPr>
+        <w:rFonts w:hint="default"/>
+      </w:rPr>
+    </w:lvl>
+    <w:lvl w:ilvl="1">
+      <w:start w:val="1"/>
+      <w:numFmt w:val="decimal"/>
+      <w:lvlText w:val="%1.%2"/>
+      <w:lvlJc w:val="left"/>
+      <w:pPr>
+        <w:ind w:left="1776" w:hanging="360"/>
+      </w:pPr>
+      <w:rPr>
+        <w:rFonts w:hint="default"/>
+      </w:rPr>
+    </w:lvl>
+    <w:lvl w:ilvl="2">
+      <w:start w:val="1"/>
+      <w:numFmt w:val="decimal"/>
+      <w:lvlText w:val="%1.%2.%3"/>
+      <w:lvlJc w:val="left"/>
+      <w:pPr>
+        <w:ind w:left="3552" w:hanging="720"/>
+      </w:pPr>
+      <w:rPr>
+        <w:rFonts w:hint="default"/>
+      </w:rPr>
+    </w:lvl>
+    <w:lvl w:ilvl="3">
+      <w:start w:val="1"/>
+      <w:numFmt w:val="decimal"/>
+      <w:lvlText w:val="%1.%2.%3.%4"/>
+      <w:lvlJc w:val="left"/>
+      <w:pPr>
+        <w:ind w:left="4968" w:hanging="720"/>
+      </w:pPr>
+      <w:rPr>
+        <w:rFonts w:hint="default"/>
+      </w:rPr>
+    </w:lvl>
+    <w:lvl w:ilvl="4">
+      <w:start w:val="1"/>
+      <w:numFmt w:val="decimal"/>
+      <w:lvlText w:val="%1.%2.%3.%4.%5"/>
+      <w:lvlJc w:val="left"/>
+      <w:pPr>
+        <w:ind w:left="6744" w:hanging="1080"/>
+      </w:pPr>
+      <w:rPr>
+        <w:rFonts w:hint="default"/>
+      </w:rPr>
+    </w:lvl>
+    <w:lvl w:ilvl="5">
+      <w:start w:val="1"/>
+      <w:numFmt w:val="decimal"/>
+      <w:lvlText w:val="%1.%2.%3.%4.%5.%6"/>
+      <w:lvlJc w:val="left"/>
+      <w:pPr>
+        <w:ind w:left="8160" w:hanging="1080"/>
+      </w:pPr>
+      <w:rPr>
+        <w:rFonts w:hint="default"/>
+      </w:rPr>
+    </w:lvl>
+    <w:lvl w:ilvl="6">
+      <w:start w:val="1"/>
+      <w:numFmt w:val="decimal"/>
+      <w:lvlText w:val="%1.%2.%3.%4.%5.%6.%7"/>
+      <w:lvlJc w:val="left"/>
+      <w:pPr>
+        <w:ind w:left="9936" w:hanging="1440"/>
+      </w:pPr>
+      <w:rPr>
+        <w:rFonts w:hint="default"/>
+      </w:rPr>
+    </w:lvl>
+    <w:lvl w:ilvl="7">
+      <w:start w:val="1"/>
+      <w:numFmt w:val="decimal"/>
+      <w:lvlText w:val="%1.%2.%3.%4.%5.%6.%7.%8"/>
+      <w:lvlJc w:val="left"/>
+      <w:pPr>
+        <w:ind w:left="11352" w:hanging="1440"/>
+      </w:pPr>
+      <w:rPr>
+        <w:rFonts w:hint="default"/>
+      </w:rPr>
+    </w:lvl>
+    <w:lvl w:ilvl="8">
+      <w:start w:val="1"/>
+      <w:numFmt w:val="decimal"/>
+      <w:lvlText w:val="%1.%2.%3.%4.%5.%6.%7.%8.%9"/>
+      <w:lvlJc w:val="left"/>
+      <w:pPr>
+        <w:ind w:left="13128" w:hanging="1800"/>
+      </w:pPr>
+      <w:rPr>
+        <w:rFonts w:hint="default"/>
+      </w:rPr>
+    </w:lvl>
+  </w:abstractNum>
+  <w:abstractNum w:abstractNumId="11" w15:restartNumberingAfterBreak="0">
     <w:nsid w:val="517C589C"/>
     <w:multiLevelType w:val="hybridMultilevel"/>
     <w:tmpl w:val="319A495E"/>
@@ -5939,7 +6025,7 @@
       </w:rPr>
     </w:lvl>
   </w:abstractNum>
-  <w:abstractNum w:abstractNumId="11" w15:restartNumberingAfterBreak="0">
+  <w:abstractNum w:abstractNumId="12" w15:restartNumberingAfterBreak="0">
     <w:nsid w:val="52892AD8"/>
     <w:multiLevelType w:val="multilevel"/>
     <w:tmpl w:val="C8668B30"/>
@@ -6052,7 +6138,7 @@
       </w:rPr>
     </w:lvl>
   </w:abstractNum>
-  <w:abstractNum w:abstractNumId="12" w15:restartNumberingAfterBreak="0">
+  <w:abstractNum w:abstractNumId="13" w15:restartNumberingAfterBreak="0">
     <w:nsid w:val="52F246E0"/>
     <w:multiLevelType w:val="multilevel"/>
     <w:tmpl w:val="9E689E98"/>
@@ -6174,7 +6260,7 @@
       </w:rPr>
     </w:lvl>
   </w:abstractNum>
-  <w:abstractNum w:abstractNumId="13" w15:restartNumberingAfterBreak="0">
+  <w:abstractNum w:abstractNumId="14" w15:restartNumberingAfterBreak="0">
     <w:nsid w:val="55432E60"/>
     <w:multiLevelType w:val="hybridMultilevel"/>
     <w:tmpl w:val="F476D93A"/>
@@ -6287,7 +6373,7 @@
       </w:rPr>
     </w:lvl>
   </w:abstractNum>
-  <w:abstractNum w:abstractNumId="14" w15:restartNumberingAfterBreak="0">
+  <w:abstractNum w:abstractNumId="15" w15:restartNumberingAfterBreak="0">
     <w:nsid w:val="56314B75"/>
     <w:multiLevelType w:val="hybridMultilevel"/>
     <w:tmpl w:val="4CAE3690"/>
@@ -6400,7 +6486,7 @@
       </w:rPr>
     </w:lvl>
   </w:abstractNum>
-  <w:abstractNum w:abstractNumId="15" w15:restartNumberingAfterBreak="0">
+  <w:abstractNum w:abstractNumId="16" w15:restartNumberingAfterBreak="0">
     <w:nsid w:val="5D5126C1"/>
     <w:multiLevelType w:val="hybridMultilevel"/>
     <w:tmpl w:val="EB06D758"/>
@@ -6513,7 +6599,7 @@
       </w:rPr>
     </w:lvl>
   </w:abstractNum>
-  <w:abstractNum w:abstractNumId="16" w15:restartNumberingAfterBreak="0">
+  <w:abstractNum w:abstractNumId="17" w15:restartNumberingAfterBreak="0">
     <w:nsid w:val="5F4D5D86"/>
     <w:multiLevelType w:val="multilevel"/>
     <w:tmpl w:val="758E3148"/>
@@ -6635,7 +6721,7 @@
       </w:rPr>
     </w:lvl>
   </w:abstractNum>
-  <w:abstractNum w:abstractNumId="17" w15:restartNumberingAfterBreak="0">
+  <w:abstractNum w:abstractNumId="18" w15:restartNumberingAfterBreak="0">
     <w:nsid w:val="64E86BD6"/>
     <w:multiLevelType w:val="hybridMultilevel"/>
     <w:tmpl w:val="63B829A6"/>
@@ -6748,7 +6834,7 @@
       </w:rPr>
     </w:lvl>
   </w:abstractNum>
-  <w:abstractNum w:abstractNumId="18" w15:restartNumberingAfterBreak="0">
+  <w:abstractNum w:abstractNumId="19" w15:restartNumberingAfterBreak="0">
     <w:nsid w:val="67CA0F12"/>
     <w:multiLevelType w:val="hybridMultilevel"/>
     <w:tmpl w:val="CABC058E"/>
@@ -6861,7 +6947,7 @@
       </w:rPr>
     </w:lvl>
   </w:abstractNum>
-  <w:abstractNum w:abstractNumId="19" w15:restartNumberingAfterBreak="0">
+  <w:abstractNum w:abstractNumId="20" w15:restartNumberingAfterBreak="0">
     <w:nsid w:val="6E19139A"/>
     <w:multiLevelType w:val="multilevel"/>
     <w:tmpl w:val="976EFF62"/>
@@ -6974,7 +7060,7 @@
       </w:rPr>
     </w:lvl>
   </w:abstractNum>
-  <w:abstractNum w:abstractNumId="20" w15:restartNumberingAfterBreak="0">
+  <w:abstractNum w:abstractNumId="21" w15:restartNumberingAfterBreak="0">
     <w:nsid w:val="725C783D"/>
     <w:multiLevelType w:val="hybridMultilevel"/>
     <w:tmpl w:val="D4AEAAAC"/>
@@ -7063,7 +7149,7 @@
       </w:pPr>
     </w:lvl>
   </w:abstractNum>
-  <w:abstractNum w:abstractNumId="21" w15:restartNumberingAfterBreak="0">
+  <w:abstractNum w:abstractNumId="22" w15:restartNumberingAfterBreak="0">
     <w:nsid w:val="7FA663C0"/>
     <w:multiLevelType w:val="hybridMultilevel"/>
     <w:tmpl w:val="F9C222F0"/>
@@ -7177,34 +7263,34 @@
     </w:lvl>
   </w:abstractNum>
   <w:num w:numId="1" w16cid:durableId="1978103941">
-    <w:abstractNumId w:val="20"/>
+    <w:abstractNumId w:val="21"/>
   </w:num>
   <w:num w:numId="2" w16cid:durableId="1876767467">
     <w:abstractNumId w:val="2"/>
   </w:num>
   <w:num w:numId="3" w16cid:durableId="204223493">
-    <w:abstractNumId w:val="10"/>
+    <w:abstractNumId w:val="11"/>
   </w:num>
   <w:num w:numId="4" w16cid:durableId="412318052">
     <w:abstractNumId w:val="8"/>
   </w:num>
   <w:num w:numId="5" w16cid:durableId="372733197">
-    <w:abstractNumId w:val="13"/>
+    <w:abstractNumId w:val="14"/>
   </w:num>
   <w:num w:numId="6" w16cid:durableId="1735741081">
-    <w:abstractNumId w:val="21"/>
+    <w:abstractNumId w:val="22"/>
   </w:num>
   <w:num w:numId="7" w16cid:durableId="1094790255">
+    <w:abstractNumId w:val="16"/>
+  </w:num>
+  <w:num w:numId="8" w16cid:durableId="876702052">
+    <w:abstractNumId w:val="19"/>
+  </w:num>
+  <w:num w:numId="9" w16cid:durableId="814950931">
     <w:abstractNumId w:val="15"/>
   </w:num>
-  <w:num w:numId="8" w16cid:durableId="876702052">
+  <w:num w:numId="10" w16cid:durableId="1615625370">
     <w:abstractNumId w:val="18"/>
-  </w:num>
-  <w:num w:numId="9" w16cid:durableId="814950931">
-    <w:abstractNumId w:val="14"/>
-  </w:num>
-  <w:num w:numId="10" w16cid:durableId="1615625370">
-    <w:abstractNumId w:val="17"/>
   </w:num>
   <w:num w:numId="11" w16cid:durableId="424424439">
     <w:abstractNumId w:val="6"/>
@@ -7222,25 +7308,28 @@
     <w:abstractNumId w:val="5"/>
   </w:num>
   <w:num w:numId="16" w16cid:durableId="1794908464">
-    <w:abstractNumId w:val="12"/>
+    <w:abstractNumId w:val="13"/>
   </w:num>
   <w:num w:numId="17" w16cid:durableId="562955145">
     <w:abstractNumId w:val="7"/>
   </w:num>
   <w:num w:numId="18" w16cid:durableId="1863937486">
-    <w:abstractNumId w:val="16"/>
+    <w:abstractNumId w:val="17"/>
   </w:num>
   <w:num w:numId="19" w16cid:durableId="12923202">
-    <w:abstractNumId w:val="19"/>
+    <w:abstractNumId w:val="20"/>
   </w:num>
   <w:num w:numId="20" w16cid:durableId="1136990893">
     <w:abstractNumId w:val="3"/>
   </w:num>
   <w:num w:numId="21" w16cid:durableId="331690757">
-    <w:abstractNumId w:val="11"/>
+    <w:abstractNumId w:val="12"/>
   </w:num>
   <w:num w:numId="22" w16cid:durableId="664627922">
     <w:abstractNumId w:val="0"/>
+  </w:num>
+  <w:num w:numId="23" w16cid:durableId="154534637">
+    <w:abstractNumId w:val="10"/>
   </w:num>
 </w:numbering>
 </file>

</xml_diff>